<commit_message>
Rumus Perpangkatan Universal 4.0 || [16:38 (W . I . B (Waktu Indonesia bagian Barat)), 31/08/2026], Jakarta Barat, Daerah Khusus Ibukota (DKI) Jakarta, Indonesia || #MELAWANKEMISKINANDENGANPENDIDIKAN #MELAWANPEMERINTAHKORUPPENINDASRAKYATINDONESIADENGANPENGETAHUAN #LAWANPEMERINTAHINDONESIAKORUPPENINDASRAKYATINDONESIADENGANPENGETAHUAN
Rumus Perpangkatan Universal 4.0 || [16:38 (W . I . B (Waktu Indonesia bagian Barat)), 31/08/2026], Jakarta Barat, Daerah Khusus Ibukota (DKI) Jakarta, Indonesia || #MELAWANKEMISKINANDENGANPENDIDIKAN #MELAWANPEMERINTAHKORUPPENINDASRAKYATINDONESIADENGANPENGETAHUAN #LAWANPEMERINTAHINDONESIAKORUPPENINDASRAKYATINDONESIADENGANPENGETAHUAN
</commit_message>
<xml_diff>
--- a/Rumus Perpangkatan Universal 4.0.docx
+++ b/Rumus Perpangkatan Universal 4.0.docx
@@ -13,41 +13,13 @@
           <w:lang w:val="id-ID"/>
         </w:rPr>
       </w:pPr>
-      <w:proofErr w:type="spellStart"/>
       <w:r>
         <w:rPr>
           <w:rFonts w:ascii="Times New Roman" w:eastAsiaTheme="minorEastAsia" w:hAnsi="Times New Roman" w:cs="Times New Roman"/>
           <w:sz w:val="24"/>
           <w:szCs w:val="24"/>
         </w:rPr>
-        <w:t>Rumus</w:t>
-      </w:r>
-      <w:proofErr w:type="spellEnd"/>
-      <w:r>
-        <w:rPr>
-          <w:rFonts w:ascii="Times New Roman" w:eastAsiaTheme="minorEastAsia" w:hAnsi="Times New Roman" w:cs="Times New Roman"/>
-          <w:sz w:val="24"/>
-          <w:szCs w:val="24"/>
-        </w:rPr>
-        <w:t xml:space="preserve"> </w:t>
-      </w:r>
-      <w:proofErr w:type="spellStart"/>
-      <w:r>
-        <w:rPr>
-          <w:rFonts w:ascii="Times New Roman" w:eastAsiaTheme="minorEastAsia" w:hAnsi="Times New Roman" w:cs="Times New Roman"/>
-          <w:sz w:val="24"/>
-          <w:szCs w:val="24"/>
-        </w:rPr>
-        <w:t>Perpangkatan</w:t>
-      </w:r>
-      <w:proofErr w:type="spellEnd"/>
-      <w:r>
-        <w:rPr>
-          <w:rFonts w:ascii="Times New Roman" w:eastAsiaTheme="minorEastAsia" w:hAnsi="Times New Roman" w:cs="Times New Roman"/>
-          <w:sz w:val="24"/>
-          <w:szCs w:val="24"/>
-        </w:rPr>
-        <w:t xml:space="preserve"> Universal </w:t>
+        <w:t xml:space="preserve">Rumus Perpangkatan Universal </w:t>
       </w:r>
       <w:r>
         <w:rPr>
@@ -77,7 +49,6 @@
           <w:lang w:val="id-ID"/>
         </w:rPr>
       </w:pPr>
-      <w:proofErr w:type="spellStart"/>
       <w:r>
         <w:rPr>
           <w:rFonts w:ascii="Times New Roman" w:eastAsiaTheme="minorEastAsia" w:hAnsi="Times New Roman" w:cs="Times New Roman"/>
@@ -85,37 +56,7 @@
           <w:szCs w:val="24"/>
           <w:lang w:val="id-ID"/>
         </w:rPr>
-        <w:t>by</w:t>
-      </w:r>
-      <w:proofErr w:type="spellEnd"/>
-      <w:r>
-        <w:rPr>
-          <w:rFonts w:ascii="Times New Roman" w:eastAsiaTheme="minorEastAsia" w:hAnsi="Times New Roman" w:cs="Times New Roman"/>
-          <w:sz w:val="24"/>
-          <w:szCs w:val="24"/>
-          <w:lang w:val="id-ID"/>
-        </w:rPr>
-        <w:t xml:space="preserve"> : Samuel Hasiholan Omega Purba, S. </w:t>
-      </w:r>
-      <w:proofErr w:type="spellStart"/>
-      <w:r>
-        <w:rPr>
-          <w:rFonts w:ascii="Times New Roman" w:eastAsiaTheme="minorEastAsia" w:hAnsi="Times New Roman" w:cs="Times New Roman"/>
-          <w:sz w:val="24"/>
-          <w:szCs w:val="24"/>
-          <w:lang w:val="id-ID"/>
-        </w:rPr>
-        <w:t>Tr</w:t>
-      </w:r>
-      <w:proofErr w:type="spellEnd"/>
-      <w:r>
-        <w:rPr>
-          <w:rFonts w:ascii="Times New Roman" w:eastAsiaTheme="minorEastAsia" w:hAnsi="Times New Roman" w:cs="Times New Roman"/>
-          <w:sz w:val="24"/>
-          <w:szCs w:val="24"/>
-          <w:lang w:val="id-ID"/>
-        </w:rPr>
-        <w:t>. T.</w:t>
+        <w:t>by : Samuel Hasiholan Omega Purba, S. Tr. T.</w:t>
       </w:r>
     </w:p>
     <w:p>
@@ -150,7 +91,6 @@
           <w:lang w:val="id-ID"/>
         </w:rPr>
       </w:pPr>
-      <w:proofErr w:type="spellStart"/>
       <w:r>
         <w:rPr>
           <w:rFonts w:ascii="Times New Roman" w:eastAsiaTheme="minorEastAsia" w:hAnsi="Times New Roman" w:cs="Times New Roman"/>
@@ -158,17 +98,7 @@
           <w:szCs w:val="24"/>
           <w:lang w:val="id-ID"/>
         </w:rPr>
-        <w:t>Prodi</w:t>
-      </w:r>
-      <w:proofErr w:type="spellEnd"/>
-      <w:r>
-        <w:rPr>
-          <w:rFonts w:ascii="Times New Roman" w:eastAsiaTheme="minorEastAsia" w:hAnsi="Times New Roman" w:cs="Times New Roman"/>
-          <w:sz w:val="24"/>
-          <w:szCs w:val="24"/>
-          <w:lang w:val="id-ID"/>
-        </w:rPr>
-        <w:t xml:space="preserve"> Teknik Robotika dan Kecerdasan buatan</w:t>
+        <w:t>Prodi Teknik Robotika dan Kecerdasan buatan</w:t>
       </w:r>
     </w:p>
     <w:p>
@@ -252,8 +182,6 @@
                 </m:r>
                 <m:d>
                   <m:dPr>
-                    <m:begChr m:val="["/>
-                    <m:endChr m:val="]"/>
                     <m:ctrlPr>
                       <w:rPr>
                         <w:rFonts w:ascii="Cambria Math" w:hAnsi="Cambria Math" w:cs="Times New Roman"/>
@@ -264,8 +192,16 @@
                     </m:ctrlPr>
                   </m:dPr>
                   <m:e>
-                    <m:d>
-                      <m:dPr>
+                    <m:r>
+                      <w:rPr>
+                        <w:rFonts w:ascii="Cambria Math" w:hAnsi="Cambria Math" w:cs="Times New Roman"/>
+                        <w:sz w:val="24"/>
+                        <w:szCs w:val="24"/>
+                      </w:rPr>
+                      <m:t xml:space="preserve"> -8, 3941</m:t>
+                    </m:r>
+                    <m:sSub>
+                      <m:sSubPr>
                         <m:ctrlPr>
                           <w:rPr>
                             <w:rFonts w:ascii="Cambria Math" w:hAnsi="Cambria Math" w:cs="Times New Roman"/>
@@ -274,7 +210,7 @@
                             <w:szCs w:val="24"/>
                           </w:rPr>
                         </m:ctrlPr>
-                      </m:dPr>
+                      </m:sSubPr>
                       <m:e>
                         <m:r>
                           <w:rPr>
@@ -282,10 +218,12 @@
                             <w:sz w:val="24"/>
                             <w:szCs w:val="24"/>
                           </w:rPr>
-                          <m:t xml:space="preserve"> -8, 3941</m:t>
+                          <m:t>6</m:t>
                         </m:r>
-                        <m:sSub>
-                          <m:sSubPr>
+                      </m:e>
+                      <m:sub>
+                        <m:d>
+                          <m:dPr>
                             <m:ctrlPr>
                               <w:rPr>
                                 <w:rFonts w:ascii="Cambria Math" w:hAnsi="Cambria Math" w:cs="Times New Roman"/>
@@ -294,7 +232,7 @@
                                 <w:szCs w:val="24"/>
                               </w:rPr>
                             </m:ctrlPr>
-                          </m:sSubPr>
+                          </m:dPr>
                           <m:e>
                             <m:r>
                               <w:rPr>
@@ -302,12 +240,10 @@
                                 <w:sz w:val="24"/>
                                 <w:szCs w:val="24"/>
                               </w:rPr>
-                              <m:t>6</m:t>
+                              <m:t xml:space="preserve">n= </m:t>
                             </m:r>
-                          </m:e>
-                          <m:sub>
-                            <m:d>
-                              <m:dPr>
+                            <m:func>
+                              <m:funcPr>
                                 <m:ctrlPr>
                                   <w:rPr>
                                     <w:rFonts w:ascii="Cambria Math" w:hAnsi="Cambria Math" w:cs="Times New Roman"/>
@@ -316,18 +252,10 @@
                                     <w:szCs w:val="24"/>
                                   </w:rPr>
                                 </m:ctrlPr>
-                              </m:dPr>
-                              <m:e>
-                                <m:r>
-                                  <w:rPr>
-                                    <w:rFonts w:ascii="Cambria Math" w:hAnsi="Cambria Math" w:cs="Times New Roman"/>
-                                    <w:sz w:val="24"/>
-                                    <w:szCs w:val="24"/>
-                                  </w:rPr>
-                                  <m:t xml:space="preserve">n= </m:t>
-                                </m:r>
-                                <m:func>
-                                  <m:funcPr>
+                              </m:funcPr>
+                              <m:fName>
+                                <m:limLow>
+                                  <m:limLowPr>
                                     <m:ctrlPr>
                                       <w:rPr>
                                         <w:rFonts w:ascii="Cambria Math" w:hAnsi="Cambria Math" w:cs="Times New Roman"/>
@@ -336,59 +264,21 @@
                                         <w:szCs w:val="24"/>
                                       </w:rPr>
                                     </m:ctrlPr>
-                                  </m:funcPr>
-                                  <m:fName>
-                                    <m:limLow>
-                                      <m:limLowPr>
-                                        <m:ctrlPr>
-                                          <w:rPr>
-                                            <w:rFonts w:ascii="Cambria Math" w:hAnsi="Cambria Math" w:cs="Times New Roman"/>
-                                            <w:i/>
-                                            <w:sz w:val="24"/>
-                                            <w:szCs w:val="24"/>
-                                          </w:rPr>
-                                        </m:ctrlPr>
-                                      </m:limLowPr>
-                                      <m:e>
-                                        <m:r>
-                                          <m:rPr>
-                                            <m:sty m:val="p"/>
-                                          </m:rPr>
-                                          <w:rPr>
-                                            <w:rFonts w:ascii="Cambria Math" w:hAnsi="Cambria Math" w:cs="Times New Roman"/>
-                                            <w:sz w:val="24"/>
-                                            <w:szCs w:val="24"/>
-                                          </w:rPr>
-                                          <m:t>lim</m:t>
-                                        </m:r>
-                                      </m:e>
-                                      <m:lim>
-                                        <m:d>
-                                          <m:dPr>
-                                            <m:ctrlPr>
-                                              <w:rPr>
-                                                <w:rFonts w:ascii="Cambria Math" w:hAnsi="Cambria Math" w:cs="Times New Roman"/>
-                                                <w:i/>
-                                                <w:sz w:val="24"/>
-                                                <w:szCs w:val="24"/>
-                                              </w:rPr>
-                                            </m:ctrlPr>
-                                          </m:dPr>
-                                          <m:e>
-                                            <m:r>
-                                              <w:rPr>
-                                                <w:rFonts w:ascii="Cambria Math" w:hAnsi="Cambria Math" w:cs="Times New Roman"/>
-                                                <w:sz w:val="24"/>
-                                                <w:szCs w:val="24"/>
-                                              </w:rPr>
-                                              <m:t>n → ∞</m:t>
-                                            </m:r>
-                                          </m:e>
-                                        </m:d>
-                                      </m:lim>
-                                    </m:limLow>
-                                  </m:fName>
+                                  </m:limLowPr>
                                   <m:e>
+                                    <m:r>
+                                      <m:rPr>
+                                        <m:sty m:val="p"/>
+                                      </m:rPr>
+                                      <w:rPr>
+                                        <w:rFonts w:ascii="Cambria Math" w:hAnsi="Cambria Math" w:cs="Times New Roman"/>
+                                        <w:sz w:val="24"/>
+                                        <w:szCs w:val="24"/>
+                                      </w:rPr>
+                                      <m:t>lim</m:t>
+                                    </m:r>
+                                  </m:e>
+                                  <m:lim>
                                     <m:d>
                                       <m:dPr>
                                         <m:ctrlPr>
@@ -407,28 +297,52 @@
                                             <w:sz w:val="24"/>
                                             <w:szCs w:val="24"/>
                                           </w:rPr>
-                                          <m:t>6</m:t>
+                                          <m:t>n → ∞</m:t>
                                         </m:r>
                                       </m:e>
                                     </m:d>
+                                  </m:lim>
+                                </m:limLow>
+                              </m:fName>
+                              <m:e>
+                                <m:d>
+                                  <m:dPr>
+                                    <m:ctrlPr>
+                                      <w:rPr>
+                                        <w:rFonts w:ascii="Cambria Math" w:hAnsi="Cambria Math" w:cs="Times New Roman"/>
+                                        <w:i/>
+                                        <w:sz w:val="24"/>
+                                        <w:szCs w:val="24"/>
+                                      </w:rPr>
+                                    </m:ctrlPr>
+                                  </m:dPr>
+                                  <m:e>
+                                    <m:r>
+                                      <w:rPr>
+                                        <w:rFonts w:ascii="Cambria Math" w:hAnsi="Cambria Math" w:cs="Times New Roman"/>
+                                        <w:sz w:val="24"/>
+                                        <w:szCs w:val="24"/>
+                                      </w:rPr>
+                                      <m:t>6</m:t>
+                                    </m:r>
                                   </m:e>
-                                </m:func>
+                                </m:d>
                               </m:e>
-                            </m:d>
-                          </m:sub>
-                        </m:sSub>
-                      </m:e>
-                    </m:d>
-                    <m:r>
-                      <w:rPr>
-                        <w:rFonts w:ascii="Cambria Math" w:hAnsi="Cambria Math" w:cs="Times New Roman"/>
-                        <w:sz w:val="24"/>
-                        <w:szCs w:val="24"/>
-                      </w:rPr>
-                      <m:t>%</m:t>
-                    </m:r>
+                            </m:func>
+                          </m:e>
+                        </m:d>
+                      </m:sub>
+                    </m:sSub>
                   </m:e>
                 </m:d>
+                <m:r>
+                  <w:rPr>
+                    <w:rFonts w:ascii="Cambria Math" w:hAnsi="Cambria Math" w:cs="Times New Roman"/>
+                    <w:sz w:val="24"/>
+                    <w:szCs w:val="24"/>
+                  </w:rPr>
+                  <m:t>%</m:t>
+                </m:r>
               </m:e>
             </m:d>
           </m:sub>
@@ -493,8 +407,6 @@
                         </m:r>
                         <m:d>
                           <m:dPr>
-                            <m:begChr m:val="["/>
-                            <m:endChr m:val="]"/>
                             <m:ctrlPr>
                               <w:rPr>
                                 <w:rFonts w:ascii="Cambria Math" w:hAnsi="Cambria Math" w:cs="Times New Roman"/>
@@ -505,8 +417,16 @@
                             </m:ctrlPr>
                           </m:dPr>
                           <m:e>
-                            <m:d>
-                              <m:dPr>
+                            <m:r>
+                              <w:rPr>
+                                <w:rFonts w:ascii="Cambria Math" w:hAnsi="Cambria Math" w:cs="Times New Roman"/>
+                                <w:sz w:val="24"/>
+                                <w:szCs w:val="24"/>
+                              </w:rPr>
+                              <m:t xml:space="preserve"> -8, 3941</m:t>
+                            </m:r>
+                            <m:sSub>
+                              <m:sSubPr>
                                 <m:ctrlPr>
                                   <w:rPr>
                                     <w:rFonts w:ascii="Cambria Math" w:hAnsi="Cambria Math" w:cs="Times New Roman"/>
@@ -515,7 +435,7 @@
                                     <w:szCs w:val="24"/>
                                   </w:rPr>
                                 </m:ctrlPr>
-                              </m:dPr>
+                              </m:sSubPr>
                               <m:e>
                                 <m:r>
                                   <w:rPr>
@@ -523,10 +443,12 @@
                                     <w:sz w:val="24"/>
                                     <w:szCs w:val="24"/>
                                   </w:rPr>
-                                  <m:t xml:space="preserve"> -8, 3941</m:t>
+                                  <m:t>6</m:t>
                                 </m:r>
-                                <m:sSub>
-                                  <m:sSubPr>
+                              </m:e>
+                              <m:sub>
+                                <m:d>
+                                  <m:dPr>
                                     <m:ctrlPr>
                                       <w:rPr>
                                         <w:rFonts w:ascii="Cambria Math" w:hAnsi="Cambria Math" w:cs="Times New Roman"/>
@@ -535,7 +457,7 @@
                                         <w:szCs w:val="24"/>
                                       </w:rPr>
                                     </m:ctrlPr>
-                                  </m:sSubPr>
+                                  </m:dPr>
                                   <m:e>
                                     <m:r>
                                       <w:rPr>
@@ -543,12 +465,10 @@
                                         <w:sz w:val="24"/>
                                         <w:szCs w:val="24"/>
                                       </w:rPr>
-                                      <m:t>6</m:t>
+                                      <m:t xml:space="preserve">n= </m:t>
                                     </m:r>
-                                  </m:e>
-                                  <m:sub>
-                                    <m:d>
-                                      <m:dPr>
+                                    <m:func>
+                                      <m:funcPr>
                                         <m:ctrlPr>
                                           <w:rPr>
                                             <w:rFonts w:ascii="Cambria Math" w:hAnsi="Cambria Math" w:cs="Times New Roman"/>
@@ -557,18 +477,10 @@
                                             <w:szCs w:val="24"/>
                                           </w:rPr>
                                         </m:ctrlPr>
-                                      </m:dPr>
-                                      <m:e>
-                                        <m:r>
-                                          <w:rPr>
-                                            <w:rFonts w:ascii="Cambria Math" w:hAnsi="Cambria Math" w:cs="Times New Roman"/>
-                                            <w:sz w:val="24"/>
-                                            <w:szCs w:val="24"/>
-                                          </w:rPr>
-                                          <m:t xml:space="preserve">n= </m:t>
-                                        </m:r>
-                                        <m:func>
-                                          <m:funcPr>
+                                      </m:funcPr>
+                                      <m:fName>
+                                        <m:limLow>
+                                          <m:limLowPr>
                                             <m:ctrlPr>
                                               <w:rPr>
                                                 <w:rFonts w:ascii="Cambria Math" w:hAnsi="Cambria Math" w:cs="Times New Roman"/>
@@ -577,59 +489,21 @@
                                                 <w:szCs w:val="24"/>
                                               </w:rPr>
                                             </m:ctrlPr>
-                                          </m:funcPr>
-                                          <m:fName>
-                                            <m:limLow>
-                                              <m:limLowPr>
-                                                <m:ctrlPr>
-                                                  <w:rPr>
-                                                    <w:rFonts w:ascii="Cambria Math" w:hAnsi="Cambria Math" w:cs="Times New Roman"/>
-                                                    <w:i/>
-                                                    <w:sz w:val="24"/>
-                                                    <w:szCs w:val="24"/>
-                                                  </w:rPr>
-                                                </m:ctrlPr>
-                                              </m:limLowPr>
-                                              <m:e>
-                                                <m:r>
-                                                  <m:rPr>
-                                                    <m:sty m:val="p"/>
-                                                  </m:rPr>
-                                                  <w:rPr>
-                                                    <w:rFonts w:ascii="Cambria Math" w:hAnsi="Cambria Math" w:cs="Times New Roman"/>
-                                                    <w:sz w:val="24"/>
-                                                    <w:szCs w:val="24"/>
-                                                  </w:rPr>
-                                                  <m:t>lim</m:t>
-                                                </m:r>
-                                              </m:e>
-                                              <m:lim>
-                                                <m:d>
-                                                  <m:dPr>
-                                                    <m:ctrlPr>
-                                                      <w:rPr>
-                                                        <w:rFonts w:ascii="Cambria Math" w:hAnsi="Cambria Math" w:cs="Times New Roman"/>
-                                                        <w:i/>
-                                                        <w:sz w:val="24"/>
-                                                        <w:szCs w:val="24"/>
-                                                      </w:rPr>
-                                                    </m:ctrlPr>
-                                                  </m:dPr>
-                                                  <m:e>
-                                                    <m:r>
-                                                      <w:rPr>
-                                                        <w:rFonts w:ascii="Cambria Math" w:hAnsi="Cambria Math" w:cs="Times New Roman"/>
-                                                        <w:sz w:val="24"/>
-                                                        <w:szCs w:val="24"/>
-                                                      </w:rPr>
-                                                      <m:t>n → ∞</m:t>
-                                                    </m:r>
-                                                  </m:e>
-                                                </m:d>
-                                              </m:lim>
-                                            </m:limLow>
-                                          </m:fName>
+                                          </m:limLowPr>
                                           <m:e>
+                                            <m:r>
+                                              <m:rPr>
+                                                <m:sty m:val="p"/>
+                                              </m:rPr>
+                                              <w:rPr>
+                                                <w:rFonts w:ascii="Cambria Math" w:hAnsi="Cambria Math" w:cs="Times New Roman"/>
+                                                <w:sz w:val="24"/>
+                                                <w:szCs w:val="24"/>
+                                              </w:rPr>
+                                              <m:t>lim</m:t>
+                                            </m:r>
+                                          </m:e>
+                                          <m:lim>
                                             <m:d>
                                               <m:dPr>
                                                 <m:ctrlPr>
@@ -648,28 +522,52 @@
                                                     <w:sz w:val="24"/>
                                                     <w:szCs w:val="24"/>
                                                   </w:rPr>
-                                                  <m:t>6</m:t>
+                                                  <m:t>n → ∞</m:t>
                                                 </m:r>
                                               </m:e>
                                             </m:d>
+                                          </m:lim>
+                                        </m:limLow>
+                                      </m:fName>
+                                      <m:e>
+                                        <m:d>
+                                          <m:dPr>
+                                            <m:ctrlPr>
+                                              <w:rPr>
+                                                <w:rFonts w:ascii="Cambria Math" w:hAnsi="Cambria Math" w:cs="Times New Roman"/>
+                                                <w:i/>
+                                                <w:sz w:val="24"/>
+                                                <w:szCs w:val="24"/>
+                                              </w:rPr>
+                                            </m:ctrlPr>
+                                          </m:dPr>
+                                          <m:e>
+                                            <m:r>
+                                              <w:rPr>
+                                                <w:rFonts w:ascii="Cambria Math" w:hAnsi="Cambria Math" w:cs="Times New Roman"/>
+                                                <w:sz w:val="24"/>
+                                                <w:szCs w:val="24"/>
+                                              </w:rPr>
+                                              <m:t>6</m:t>
+                                            </m:r>
                                           </m:e>
-                                        </m:func>
+                                        </m:d>
                                       </m:e>
-                                    </m:d>
-                                  </m:sub>
-                                </m:sSub>
-                              </m:e>
-                            </m:d>
-                            <m:r>
-                              <w:rPr>
-                                <w:rFonts w:ascii="Cambria Math" w:hAnsi="Cambria Math" w:cs="Times New Roman"/>
-                                <w:sz w:val="24"/>
-                                <w:szCs w:val="24"/>
-                              </w:rPr>
-                              <m:t>%</m:t>
-                            </m:r>
+                                    </m:func>
+                                  </m:e>
+                                </m:d>
+                              </m:sub>
+                            </m:sSub>
                           </m:e>
                         </m:d>
+                        <m:r>
+                          <w:rPr>
+                            <w:rFonts w:ascii="Cambria Math" w:hAnsi="Cambria Math" w:cs="Times New Roman"/>
+                            <w:sz w:val="24"/>
+                            <w:szCs w:val="24"/>
+                          </w:rPr>
+                          <m:t>%</m:t>
+                        </m:r>
                       </m:e>
                     </m:d>
                   </m:lim>
@@ -785,8 +683,6 @@
                 </m:r>
                 <m:d>
                   <m:dPr>
-                    <m:begChr m:val="["/>
-                    <m:endChr m:val="]"/>
                     <m:ctrlPr>
                       <w:rPr>
                         <w:rFonts w:ascii="Cambria Math" w:hAnsi="Cambria Math" w:cs="Times New Roman"/>
@@ -797,8 +693,16 @@
                     </m:ctrlPr>
                   </m:dPr>
                   <m:e>
-                    <m:d>
-                      <m:dPr>
+                    <m:r>
+                      <w:rPr>
+                        <w:rFonts w:ascii="Cambria Math" w:hAnsi="Cambria Math" w:cs="Times New Roman"/>
+                        <w:sz w:val="24"/>
+                        <w:szCs w:val="24"/>
+                      </w:rPr>
+                      <m:t xml:space="preserve"> -8, 3941</m:t>
+                    </m:r>
+                    <m:sSub>
+                      <m:sSubPr>
                         <m:ctrlPr>
                           <w:rPr>
                             <w:rFonts w:ascii="Cambria Math" w:hAnsi="Cambria Math" w:cs="Times New Roman"/>
@@ -807,7 +711,7 @@
                             <w:szCs w:val="24"/>
                           </w:rPr>
                         </m:ctrlPr>
-                      </m:dPr>
+                      </m:sSubPr>
                       <m:e>
                         <m:r>
                           <w:rPr>
@@ -815,10 +719,12 @@
                             <w:sz w:val="24"/>
                             <w:szCs w:val="24"/>
                           </w:rPr>
-                          <m:t xml:space="preserve"> -8, 3941</m:t>
+                          <m:t>6</m:t>
                         </m:r>
-                        <m:sSub>
-                          <m:sSubPr>
+                      </m:e>
+                      <m:sub>
+                        <m:d>
+                          <m:dPr>
                             <m:ctrlPr>
                               <w:rPr>
                                 <w:rFonts w:ascii="Cambria Math" w:hAnsi="Cambria Math" w:cs="Times New Roman"/>
@@ -827,7 +733,7 @@
                                 <w:szCs w:val="24"/>
                               </w:rPr>
                             </m:ctrlPr>
-                          </m:sSubPr>
+                          </m:dPr>
                           <m:e>
                             <m:r>
                               <w:rPr>
@@ -835,12 +741,10 @@
                                 <w:sz w:val="24"/>
                                 <w:szCs w:val="24"/>
                               </w:rPr>
-                              <m:t>6</m:t>
+                              <m:t xml:space="preserve">n= </m:t>
                             </m:r>
-                          </m:e>
-                          <m:sub>
-                            <m:d>
-                              <m:dPr>
+                            <m:func>
+                              <m:funcPr>
                                 <m:ctrlPr>
                                   <w:rPr>
                                     <w:rFonts w:ascii="Cambria Math" w:hAnsi="Cambria Math" w:cs="Times New Roman"/>
@@ -849,18 +753,10 @@
                                     <w:szCs w:val="24"/>
                                   </w:rPr>
                                 </m:ctrlPr>
-                              </m:dPr>
-                              <m:e>
-                                <m:r>
-                                  <w:rPr>
-                                    <w:rFonts w:ascii="Cambria Math" w:hAnsi="Cambria Math" w:cs="Times New Roman"/>
-                                    <w:sz w:val="24"/>
-                                    <w:szCs w:val="24"/>
-                                  </w:rPr>
-                                  <m:t xml:space="preserve">n= </m:t>
-                                </m:r>
-                                <m:func>
-                                  <m:funcPr>
+                              </m:funcPr>
+                              <m:fName>
+                                <m:limLow>
+                                  <m:limLowPr>
                                     <m:ctrlPr>
                                       <w:rPr>
                                         <w:rFonts w:ascii="Cambria Math" w:hAnsi="Cambria Math" w:cs="Times New Roman"/>
@@ -869,59 +765,21 @@
                                         <w:szCs w:val="24"/>
                                       </w:rPr>
                                     </m:ctrlPr>
-                                  </m:funcPr>
-                                  <m:fName>
-                                    <m:limLow>
-                                      <m:limLowPr>
-                                        <m:ctrlPr>
-                                          <w:rPr>
-                                            <w:rFonts w:ascii="Cambria Math" w:hAnsi="Cambria Math" w:cs="Times New Roman"/>
-                                            <w:i/>
-                                            <w:sz w:val="24"/>
-                                            <w:szCs w:val="24"/>
-                                          </w:rPr>
-                                        </m:ctrlPr>
-                                      </m:limLowPr>
-                                      <m:e>
-                                        <m:r>
-                                          <m:rPr>
-                                            <m:sty m:val="p"/>
-                                          </m:rPr>
-                                          <w:rPr>
-                                            <w:rFonts w:ascii="Cambria Math" w:hAnsi="Cambria Math" w:cs="Times New Roman"/>
-                                            <w:sz w:val="24"/>
-                                            <w:szCs w:val="24"/>
-                                          </w:rPr>
-                                          <m:t>lim</m:t>
-                                        </m:r>
-                                      </m:e>
-                                      <m:lim>
-                                        <m:d>
-                                          <m:dPr>
-                                            <m:ctrlPr>
-                                              <w:rPr>
-                                                <w:rFonts w:ascii="Cambria Math" w:hAnsi="Cambria Math" w:cs="Times New Roman"/>
-                                                <w:i/>
-                                                <w:sz w:val="24"/>
-                                                <w:szCs w:val="24"/>
-                                              </w:rPr>
-                                            </m:ctrlPr>
-                                          </m:dPr>
-                                          <m:e>
-                                            <m:r>
-                                              <w:rPr>
-                                                <w:rFonts w:ascii="Cambria Math" w:hAnsi="Cambria Math" w:cs="Times New Roman"/>
-                                                <w:sz w:val="24"/>
-                                                <w:szCs w:val="24"/>
-                                              </w:rPr>
-                                              <m:t>n → ∞</m:t>
-                                            </m:r>
-                                          </m:e>
-                                        </m:d>
-                                      </m:lim>
-                                    </m:limLow>
-                                  </m:fName>
+                                  </m:limLowPr>
                                   <m:e>
+                                    <m:r>
+                                      <m:rPr>
+                                        <m:sty m:val="p"/>
+                                      </m:rPr>
+                                      <w:rPr>
+                                        <w:rFonts w:ascii="Cambria Math" w:hAnsi="Cambria Math" w:cs="Times New Roman"/>
+                                        <w:sz w:val="24"/>
+                                        <w:szCs w:val="24"/>
+                                      </w:rPr>
+                                      <m:t>lim</m:t>
+                                    </m:r>
+                                  </m:e>
+                                  <m:lim>
                                     <m:d>
                                       <m:dPr>
                                         <m:ctrlPr>
@@ -940,28 +798,52 @@
                                             <w:sz w:val="24"/>
                                             <w:szCs w:val="24"/>
                                           </w:rPr>
-                                          <m:t>6</m:t>
+                                          <m:t>n → ∞</m:t>
                                         </m:r>
                                       </m:e>
                                     </m:d>
+                                  </m:lim>
+                                </m:limLow>
+                              </m:fName>
+                              <m:e>
+                                <m:d>
+                                  <m:dPr>
+                                    <m:ctrlPr>
+                                      <w:rPr>
+                                        <w:rFonts w:ascii="Cambria Math" w:hAnsi="Cambria Math" w:cs="Times New Roman"/>
+                                        <w:i/>
+                                        <w:sz w:val="24"/>
+                                        <w:szCs w:val="24"/>
+                                      </w:rPr>
+                                    </m:ctrlPr>
+                                  </m:dPr>
+                                  <m:e>
+                                    <m:r>
+                                      <w:rPr>
+                                        <w:rFonts w:ascii="Cambria Math" w:hAnsi="Cambria Math" w:cs="Times New Roman"/>
+                                        <w:sz w:val="24"/>
+                                        <w:szCs w:val="24"/>
+                                      </w:rPr>
+                                      <m:t>6</m:t>
+                                    </m:r>
                                   </m:e>
-                                </m:func>
+                                </m:d>
                               </m:e>
-                            </m:d>
-                          </m:sub>
-                        </m:sSub>
-                      </m:e>
-                    </m:d>
-                    <m:r>
-                      <w:rPr>
-                        <w:rFonts w:ascii="Cambria Math" w:hAnsi="Cambria Math" w:cs="Times New Roman"/>
-                        <w:sz w:val="24"/>
-                        <w:szCs w:val="24"/>
-                      </w:rPr>
-                      <m:t>%</m:t>
-                    </m:r>
+                            </m:func>
+                          </m:e>
+                        </m:d>
+                      </m:sub>
+                    </m:sSub>
                   </m:e>
                 </m:d>
+                <m:r>
+                  <w:rPr>
+                    <w:rFonts w:ascii="Cambria Math" w:hAnsi="Cambria Math" w:cs="Times New Roman"/>
+                    <w:sz w:val="24"/>
+                    <w:szCs w:val="24"/>
+                  </w:rPr>
+                  <m:t>%</m:t>
+                </m:r>
               </m:e>
             </m:d>
           </m:sub>
@@ -1026,8 +908,6 @@
                         </m:r>
                         <m:d>
                           <m:dPr>
-                            <m:begChr m:val="["/>
-                            <m:endChr m:val="]"/>
                             <m:ctrlPr>
                               <w:rPr>
                                 <w:rFonts w:ascii="Cambria Math" w:hAnsi="Cambria Math" w:cs="Times New Roman"/>
@@ -1038,8 +918,16 @@
                             </m:ctrlPr>
                           </m:dPr>
                           <m:e>
-                            <m:d>
-                              <m:dPr>
+                            <m:r>
+                              <w:rPr>
+                                <w:rFonts w:ascii="Cambria Math" w:hAnsi="Cambria Math" w:cs="Times New Roman"/>
+                                <w:sz w:val="24"/>
+                                <w:szCs w:val="24"/>
+                              </w:rPr>
+                              <m:t xml:space="preserve"> -8, 3941</m:t>
+                            </m:r>
+                            <m:sSub>
+                              <m:sSubPr>
                                 <m:ctrlPr>
                                   <w:rPr>
                                     <w:rFonts w:ascii="Cambria Math" w:hAnsi="Cambria Math" w:cs="Times New Roman"/>
@@ -1048,7 +936,7 @@
                                     <w:szCs w:val="24"/>
                                   </w:rPr>
                                 </m:ctrlPr>
-                              </m:dPr>
+                              </m:sSubPr>
                               <m:e>
                                 <m:r>
                                   <w:rPr>
@@ -1056,10 +944,12 @@
                                     <w:sz w:val="24"/>
                                     <w:szCs w:val="24"/>
                                   </w:rPr>
-                                  <m:t xml:space="preserve"> -8, 3941</m:t>
+                                  <m:t>6</m:t>
                                 </m:r>
-                                <m:sSub>
-                                  <m:sSubPr>
+                              </m:e>
+                              <m:sub>
+                                <m:d>
+                                  <m:dPr>
                                     <m:ctrlPr>
                                       <w:rPr>
                                         <w:rFonts w:ascii="Cambria Math" w:hAnsi="Cambria Math" w:cs="Times New Roman"/>
@@ -1068,7 +958,7 @@
                                         <w:szCs w:val="24"/>
                                       </w:rPr>
                                     </m:ctrlPr>
-                                  </m:sSubPr>
+                                  </m:dPr>
                                   <m:e>
                                     <m:r>
                                       <w:rPr>
@@ -1076,12 +966,10 @@
                                         <w:sz w:val="24"/>
                                         <w:szCs w:val="24"/>
                                       </w:rPr>
-                                      <m:t>6</m:t>
+                                      <m:t xml:space="preserve">n= </m:t>
                                     </m:r>
-                                  </m:e>
-                                  <m:sub>
-                                    <m:d>
-                                      <m:dPr>
+                                    <m:func>
+                                      <m:funcPr>
                                         <m:ctrlPr>
                                           <w:rPr>
                                             <w:rFonts w:ascii="Cambria Math" w:hAnsi="Cambria Math" w:cs="Times New Roman"/>
@@ -1090,18 +978,10 @@
                                             <w:szCs w:val="24"/>
                                           </w:rPr>
                                         </m:ctrlPr>
-                                      </m:dPr>
-                                      <m:e>
-                                        <m:r>
-                                          <w:rPr>
-                                            <w:rFonts w:ascii="Cambria Math" w:hAnsi="Cambria Math" w:cs="Times New Roman"/>
-                                            <w:sz w:val="24"/>
-                                            <w:szCs w:val="24"/>
-                                          </w:rPr>
-                                          <m:t xml:space="preserve">n= </m:t>
-                                        </m:r>
-                                        <m:func>
-                                          <m:funcPr>
+                                      </m:funcPr>
+                                      <m:fName>
+                                        <m:limLow>
+                                          <m:limLowPr>
                                             <m:ctrlPr>
                                               <w:rPr>
                                                 <w:rFonts w:ascii="Cambria Math" w:hAnsi="Cambria Math" w:cs="Times New Roman"/>
@@ -1110,59 +990,21 @@
                                                 <w:szCs w:val="24"/>
                                               </w:rPr>
                                             </m:ctrlPr>
-                                          </m:funcPr>
-                                          <m:fName>
-                                            <m:limLow>
-                                              <m:limLowPr>
-                                                <m:ctrlPr>
-                                                  <w:rPr>
-                                                    <w:rFonts w:ascii="Cambria Math" w:hAnsi="Cambria Math" w:cs="Times New Roman"/>
-                                                    <w:i/>
-                                                    <w:sz w:val="24"/>
-                                                    <w:szCs w:val="24"/>
-                                                  </w:rPr>
-                                                </m:ctrlPr>
-                                              </m:limLowPr>
-                                              <m:e>
-                                                <m:r>
-                                                  <m:rPr>
-                                                    <m:sty m:val="p"/>
-                                                  </m:rPr>
-                                                  <w:rPr>
-                                                    <w:rFonts w:ascii="Cambria Math" w:hAnsi="Cambria Math" w:cs="Times New Roman"/>
-                                                    <w:sz w:val="24"/>
-                                                    <w:szCs w:val="24"/>
-                                                  </w:rPr>
-                                                  <m:t>lim</m:t>
-                                                </m:r>
-                                              </m:e>
-                                              <m:lim>
-                                                <m:d>
-                                                  <m:dPr>
-                                                    <m:ctrlPr>
-                                                      <w:rPr>
-                                                        <w:rFonts w:ascii="Cambria Math" w:hAnsi="Cambria Math" w:cs="Times New Roman"/>
-                                                        <w:i/>
-                                                        <w:sz w:val="24"/>
-                                                        <w:szCs w:val="24"/>
-                                                      </w:rPr>
-                                                    </m:ctrlPr>
-                                                  </m:dPr>
-                                                  <m:e>
-                                                    <m:r>
-                                                      <w:rPr>
-                                                        <w:rFonts w:ascii="Cambria Math" w:hAnsi="Cambria Math" w:cs="Times New Roman"/>
-                                                        <w:sz w:val="24"/>
-                                                        <w:szCs w:val="24"/>
-                                                      </w:rPr>
-                                                      <m:t>n → ∞</m:t>
-                                                    </m:r>
-                                                  </m:e>
-                                                </m:d>
-                                              </m:lim>
-                                            </m:limLow>
-                                          </m:fName>
+                                          </m:limLowPr>
                                           <m:e>
+                                            <m:r>
+                                              <m:rPr>
+                                                <m:sty m:val="p"/>
+                                              </m:rPr>
+                                              <w:rPr>
+                                                <w:rFonts w:ascii="Cambria Math" w:hAnsi="Cambria Math" w:cs="Times New Roman"/>
+                                                <w:sz w:val="24"/>
+                                                <w:szCs w:val="24"/>
+                                              </w:rPr>
+                                              <m:t>lim</m:t>
+                                            </m:r>
+                                          </m:e>
+                                          <m:lim>
                                             <m:d>
                                               <m:dPr>
                                                 <m:ctrlPr>
@@ -1181,28 +1023,52 @@
                                                     <w:sz w:val="24"/>
                                                     <w:szCs w:val="24"/>
                                                   </w:rPr>
-                                                  <m:t>6</m:t>
+                                                  <m:t>n → ∞</m:t>
                                                 </m:r>
                                               </m:e>
                                             </m:d>
+                                          </m:lim>
+                                        </m:limLow>
+                                      </m:fName>
+                                      <m:e>
+                                        <m:d>
+                                          <m:dPr>
+                                            <m:ctrlPr>
+                                              <w:rPr>
+                                                <w:rFonts w:ascii="Cambria Math" w:hAnsi="Cambria Math" w:cs="Times New Roman"/>
+                                                <w:i/>
+                                                <w:sz w:val="24"/>
+                                                <w:szCs w:val="24"/>
+                                              </w:rPr>
+                                            </m:ctrlPr>
+                                          </m:dPr>
+                                          <m:e>
+                                            <m:r>
+                                              <w:rPr>
+                                                <w:rFonts w:ascii="Cambria Math" w:hAnsi="Cambria Math" w:cs="Times New Roman"/>
+                                                <w:sz w:val="24"/>
+                                                <w:szCs w:val="24"/>
+                                              </w:rPr>
+                                              <m:t>6</m:t>
+                                            </m:r>
                                           </m:e>
-                                        </m:func>
+                                        </m:d>
                                       </m:e>
-                                    </m:d>
-                                  </m:sub>
-                                </m:sSub>
-                              </m:e>
-                            </m:d>
-                            <m:r>
-                              <w:rPr>
-                                <w:rFonts w:ascii="Cambria Math" w:hAnsi="Cambria Math" w:cs="Times New Roman"/>
-                                <w:sz w:val="24"/>
-                                <w:szCs w:val="24"/>
-                              </w:rPr>
-                              <m:t>%</m:t>
-                            </m:r>
+                                    </m:func>
+                                  </m:e>
+                                </m:d>
+                              </m:sub>
+                            </m:sSub>
                           </m:e>
                         </m:d>
+                        <m:r>
+                          <w:rPr>
+                            <w:rFonts w:ascii="Cambria Math" w:hAnsi="Cambria Math" w:cs="Times New Roman"/>
+                            <w:sz w:val="24"/>
+                            <w:szCs w:val="24"/>
+                          </w:rPr>
+                          <m:t>%</m:t>
+                        </m:r>
                       </m:e>
                     </m:d>
                   </m:lim>

</xml_diff>

<commit_message>
docs: sync latest PDF and Word documents with GitHub repository
</commit_message>
<xml_diff>
--- a/Rumus Perpangkatan Universal 4.0.docx
+++ b/Rumus Perpangkatan Universal 4.0.docx
@@ -13,41 +13,13 @@
           <w:lang w:val="id-ID"/>
         </w:rPr>
       </w:pPr>
-      <w:proofErr w:type="spellStart"/>
       <w:r>
         <w:rPr>
           <w:rFonts w:ascii="Times New Roman" w:eastAsiaTheme="minorEastAsia" w:hAnsi="Times New Roman" w:cs="Times New Roman"/>
           <w:sz w:val="24"/>
           <w:szCs w:val="24"/>
         </w:rPr>
-        <w:t>Rumus</w:t>
-      </w:r>
-      <w:proofErr w:type="spellEnd"/>
-      <w:r>
-        <w:rPr>
-          <w:rFonts w:ascii="Times New Roman" w:eastAsiaTheme="minorEastAsia" w:hAnsi="Times New Roman" w:cs="Times New Roman"/>
-          <w:sz w:val="24"/>
-          <w:szCs w:val="24"/>
-        </w:rPr>
-        <w:t xml:space="preserve"> </w:t>
-      </w:r>
-      <w:proofErr w:type="spellStart"/>
-      <w:r>
-        <w:rPr>
-          <w:rFonts w:ascii="Times New Roman" w:eastAsiaTheme="minorEastAsia" w:hAnsi="Times New Roman" w:cs="Times New Roman"/>
-          <w:sz w:val="24"/>
-          <w:szCs w:val="24"/>
-        </w:rPr>
-        <w:t>Perpangkatan</w:t>
-      </w:r>
-      <w:proofErr w:type="spellEnd"/>
-      <w:r>
-        <w:rPr>
-          <w:rFonts w:ascii="Times New Roman" w:eastAsiaTheme="minorEastAsia" w:hAnsi="Times New Roman" w:cs="Times New Roman"/>
-          <w:sz w:val="24"/>
-          <w:szCs w:val="24"/>
-        </w:rPr>
-        <w:t xml:space="preserve"> Universal </w:t>
+        <w:t xml:space="preserve">Rumus Perpangkatan Universal </w:t>
       </w:r>
       <w:r>
         <w:rPr>
@@ -77,7 +49,6 @@
           <w:lang w:val="id-ID"/>
         </w:rPr>
       </w:pPr>
-      <w:proofErr w:type="spellStart"/>
       <w:r>
         <w:rPr>
           <w:rFonts w:ascii="Times New Roman" w:eastAsiaTheme="minorEastAsia" w:hAnsi="Times New Roman" w:cs="Times New Roman"/>
@@ -85,37 +56,7 @@
           <w:szCs w:val="24"/>
           <w:lang w:val="id-ID"/>
         </w:rPr>
-        <w:t>by</w:t>
-      </w:r>
-      <w:proofErr w:type="spellEnd"/>
-      <w:r>
-        <w:rPr>
-          <w:rFonts w:ascii="Times New Roman" w:eastAsiaTheme="minorEastAsia" w:hAnsi="Times New Roman" w:cs="Times New Roman"/>
-          <w:sz w:val="24"/>
-          <w:szCs w:val="24"/>
-          <w:lang w:val="id-ID"/>
-        </w:rPr>
-        <w:t xml:space="preserve"> : Samuel Hasiholan Omega Purba, S. </w:t>
-      </w:r>
-      <w:proofErr w:type="spellStart"/>
-      <w:r>
-        <w:rPr>
-          <w:rFonts w:ascii="Times New Roman" w:eastAsiaTheme="minorEastAsia" w:hAnsi="Times New Roman" w:cs="Times New Roman"/>
-          <w:sz w:val="24"/>
-          <w:szCs w:val="24"/>
-          <w:lang w:val="id-ID"/>
-        </w:rPr>
-        <w:t>Tr</w:t>
-      </w:r>
-      <w:proofErr w:type="spellEnd"/>
-      <w:r>
-        <w:rPr>
-          <w:rFonts w:ascii="Times New Roman" w:eastAsiaTheme="minorEastAsia" w:hAnsi="Times New Roman" w:cs="Times New Roman"/>
-          <w:sz w:val="24"/>
-          <w:szCs w:val="24"/>
-          <w:lang w:val="id-ID"/>
-        </w:rPr>
-        <w:t>. T.</w:t>
+        <w:t>by : Samuel Hasiholan Omega Purba, S. Tr. T.</w:t>
       </w:r>
     </w:p>
     <w:p>
@@ -150,7 +91,6 @@
           <w:lang w:val="id-ID"/>
         </w:rPr>
       </w:pPr>
-      <w:proofErr w:type="spellStart"/>
       <w:r>
         <w:rPr>
           <w:rFonts w:ascii="Times New Roman" w:eastAsiaTheme="minorEastAsia" w:hAnsi="Times New Roman" w:cs="Times New Roman"/>
@@ -158,17 +98,7 @@
           <w:szCs w:val="24"/>
           <w:lang w:val="id-ID"/>
         </w:rPr>
-        <w:t>Prodi</w:t>
-      </w:r>
-      <w:proofErr w:type="spellEnd"/>
-      <w:r>
-        <w:rPr>
-          <w:rFonts w:ascii="Times New Roman" w:eastAsiaTheme="minorEastAsia" w:hAnsi="Times New Roman" w:cs="Times New Roman"/>
-          <w:sz w:val="24"/>
-          <w:szCs w:val="24"/>
-          <w:lang w:val="id-ID"/>
-        </w:rPr>
-        <w:t xml:space="preserve"> Teknik Robotika dan Kecerdasan buatan</w:t>
+        <w:t>Prodi Teknik Robotika dan Kecerdasan buatan</w:t>
       </w:r>
     </w:p>
     <w:p>
@@ -252,8 +182,6 @@
                 </m:r>
                 <m:d>
                   <m:dPr>
-                    <m:begChr m:val="["/>
-                    <m:endChr m:val="]"/>
                     <m:ctrlPr>
                       <w:rPr>
                         <w:rFonts w:ascii="Cambria Math" w:hAnsi="Cambria Math" w:cs="Times New Roman"/>
@@ -264,8 +192,16 @@
                     </m:ctrlPr>
                   </m:dPr>
                   <m:e>
-                    <m:d>
-                      <m:dPr>
+                    <m:r>
+                      <w:rPr>
+                        <w:rFonts w:ascii="Cambria Math" w:hAnsi="Cambria Math" w:cs="Times New Roman"/>
+                        <w:sz w:val="24"/>
+                        <w:szCs w:val="24"/>
+                      </w:rPr>
+                      <m:t xml:space="preserve"> -8, 3941</m:t>
+                    </m:r>
+                    <m:sSub>
+                      <m:sSubPr>
                         <m:ctrlPr>
                           <w:rPr>
                             <w:rFonts w:ascii="Cambria Math" w:hAnsi="Cambria Math" w:cs="Times New Roman"/>
@@ -274,7 +210,7 @@
                             <w:szCs w:val="24"/>
                           </w:rPr>
                         </m:ctrlPr>
-                      </m:dPr>
+                      </m:sSubPr>
                       <m:e>
                         <m:r>
                           <w:rPr>
@@ -282,10 +218,12 @@
                             <w:sz w:val="24"/>
                             <w:szCs w:val="24"/>
                           </w:rPr>
-                          <m:t xml:space="preserve"> -8, 3941</m:t>
+                          <m:t>6</m:t>
                         </m:r>
-                        <m:sSub>
-                          <m:sSubPr>
+                      </m:e>
+                      <m:sub>
+                        <m:d>
+                          <m:dPr>
                             <m:ctrlPr>
                               <w:rPr>
                                 <w:rFonts w:ascii="Cambria Math" w:hAnsi="Cambria Math" w:cs="Times New Roman"/>
@@ -294,7 +232,7 @@
                                 <w:szCs w:val="24"/>
                               </w:rPr>
                             </m:ctrlPr>
-                          </m:sSubPr>
+                          </m:dPr>
                           <m:e>
                             <m:r>
                               <w:rPr>
@@ -302,12 +240,10 @@
                                 <w:sz w:val="24"/>
                                 <w:szCs w:val="24"/>
                               </w:rPr>
-                              <m:t>6</m:t>
+                              <m:t xml:space="preserve">n= </m:t>
                             </m:r>
-                          </m:e>
-                          <m:sub>
-                            <m:d>
-                              <m:dPr>
+                            <m:func>
+                              <m:funcPr>
                                 <m:ctrlPr>
                                   <w:rPr>
                                     <w:rFonts w:ascii="Cambria Math" w:hAnsi="Cambria Math" w:cs="Times New Roman"/>
@@ -316,18 +252,10 @@
                                     <w:szCs w:val="24"/>
                                   </w:rPr>
                                 </m:ctrlPr>
-                              </m:dPr>
-                              <m:e>
-                                <m:r>
-                                  <w:rPr>
-                                    <w:rFonts w:ascii="Cambria Math" w:hAnsi="Cambria Math" w:cs="Times New Roman"/>
-                                    <w:sz w:val="24"/>
-                                    <w:szCs w:val="24"/>
-                                  </w:rPr>
-                                  <m:t xml:space="preserve">n= </m:t>
-                                </m:r>
-                                <m:func>
-                                  <m:funcPr>
+                              </m:funcPr>
+                              <m:fName>
+                                <m:limLow>
+                                  <m:limLowPr>
                                     <m:ctrlPr>
                                       <w:rPr>
                                         <w:rFonts w:ascii="Cambria Math" w:hAnsi="Cambria Math" w:cs="Times New Roman"/>
@@ -336,59 +264,21 @@
                                         <w:szCs w:val="24"/>
                                       </w:rPr>
                                     </m:ctrlPr>
-                                  </m:funcPr>
-                                  <m:fName>
-                                    <m:limLow>
-                                      <m:limLowPr>
-                                        <m:ctrlPr>
-                                          <w:rPr>
-                                            <w:rFonts w:ascii="Cambria Math" w:hAnsi="Cambria Math" w:cs="Times New Roman"/>
-                                            <w:i/>
-                                            <w:sz w:val="24"/>
-                                            <w:szCs w:val="24"/>
-                                          </w:rPr>
-                                        </m:ctrlPr>
-                                      </m:limLowPr>
-                                      <m:e>
-                                        <m:r>
-                                          <m:rPr>
-                                            <m:sty m:val="p"/>
-                                          </m:rPr>
-                                          <w:rPr>
-                                            <w:rFonts w:ascii="Cambria Math" w:hAnsi="Cambria Math" w:cs="Times New Roman"/>
-                                            <w:sz w:val="24"/>
-                                            <w:szCs w:val="24"/>
-                                          </w:rPr>
-                                          <m:t>lim</m:t>
-                                        </m:r>
-                                      </m:e>
-                                      <m:lim>
-                                        <m:d>
-                                          <m:dPr>
-                                            <m:ctrlPr>
-                                              <w:rPr>
-                                                <w:rFonts w:ascii="Cambria Math" w:hAnsi="Cambria Math" w:cs="Times New Roman"/>
-                                                <w:i/>
-                                                <w:sz w:val="24"/>
-                                                <w:szCs w:val="24"/>
-                                              </w:rPr>
-                                            </m:ctrlPr>
-                                          </m:dPr>
-                                          <m:e>
-                                            <m:r>
-                                              <w:rPr>
-                                                <w:rFonts w:ascii="Cambria Math" w:hAnsi="Cambria Math" w:cs="Times New Roman"/>
-                                                <w:sz w:val="24"/>
-                                                <w:szCs w:val="24"/>
-                                              </w:rPr>
-                                              <m:t>n → ∞</m:t>
-                                            </m:r>
-                                          </m:e>
-                                        </m:d>
-                                      </m:lim>
-                                    </m:limLow>
-                                  </m:fName>
+                                  </m:limLowPr>
                                   <m:e>
+                                    <m:r>
+                                      <m:rPr>
+                                        <m:sty m:val="p"/>
+                                      </m:rPr>
+                                      <w:rPr>
+                                        <w:rFonts w:ascii="Cambria Math" w:hAnsi="Cambria Math" w:cs="Times New Roman"/>
+                                        <w:sz w:val="24"/>
+                                        <w:szCs w:val="24"/>
+                                      </w:rPr>
+                                      <m:t>lim</m:t>
+                                    </m:r>
+                                  </m:e>
+                                  <m:lim>
                                     <m:d>
                                       <m:dPr>
                                         <m:ctrlPr>
@@ -407,28 +297,52 @@
                                             <w:sz w:val="24"/>
                                             <w:szCs w:val="24"/>
                                           </w:rPr>
-                                          <m:t>6</m:t>
+                                          <m:t>n → ∞</m:t>
                                         </m:r>
                                       </m:e>
                                     </m:d>
+                                  </m:lim>
+                                </m:limLow>
+                              </m:fName>
+                              <m:e>
+                                <m:d>
+                                  <m:dPr>
+                                    <m:ctrlPr>
+                                      <w:rPr>
+                                        <w:rFonts w:ascii="Cambria Math" w:hAnsi="Cambria Math" w:cs="Times New Roman"/>
+                                        <w:i/>
+                                        <w:sz w:val="24"/>
+                                        <w:szCs w:val="24"/>
+                                      </w:rPr>
+                                    </m:ctrlPr>
+                                  </m:dPr>
+                                  <m:e>
+                                    <m:r>
+                                      <w:rPr>
+                                        <w:rFonts w:ascii="Cambria Math" w:hAnsi="Cambria Math" w:cs="Times New Roman"/>
+                                        <w:sz w:val="24"/>
+                                        <w:szCs w:val="24"/>
+                                      </w:rPr>
+                                      <m:t>6</m:t>
+                                    </m:r>
                                   </m:e>
-                                </m:func>
+                                </m:d>
                               </m:e>
-                            </m:d>
-                          </m:sub>
-                        </m:sSub>
-                      </m:e>
-                    </m:d>
-                    <m:r>
-                      <w:rPr>
-                        <w:rFonts w:ascii="Cambria Math" w:hAnsi="Cambria Math" w:cs="Times New Roman"/>
-                        <w:sz w:val="24"/>
-                        <w:szCs w:val="24"/>
-                      </w:rPr>
-                      <m:t>%</m:t>
-                    </m:r>
+                            </m:func>
+                          </m:e>
+                        </m:d>
+                      </m:sub>
+                    </m:sSub>
                   </m:e>
                 </m:d>
+                <m:r>
+                  <w:rPr>
+                    <w:rFonts w:ascii="Cambria Math" w:hAnsi="Cambria Math" w:cs="Times New Roman"/>
+                    <w:sz w:val="24"/>
+                    <w:szCs w:val="24"/>
+                  </w:rPr>
+                  <m:t>%</m:t>
+                </m:r>
               </m:e>
             </m:d>
           </m:sub>
@@ -493,8 +407,6 @@
                         </m:r>
                         <m:d>
                           <m:dPr>
-                            <m:begChr m:val="["/>
-                            <m:endChr m:val="]"/>
                             <m:ctrlPr>
                               <w:rPr>
                                 <w:rFonts w:ascii="Cambria Math" w:hAnsi="Cambria Math" w:cs="Times New Roman"/>
@@ -505,8 +417,16 @@
                             </m:ctrlPr>
                           </m:dPr>
                           <m:e>
-                            <m:d>
-                              <m:dPr>
+                            <m:r>
+                              <w:rPr>
+                                <w:rFonts w:ascii="Cambria Math" w:hAnsi="Cambria Math" w:cs="Times New Roman"/>
+                                <w:sz w:val="24"/>
+                                <w:szCs w:val="24"/>
+                              </w:rPr>
+                              <m:t xml:space="preserve"> -8, 3941</m:t>
+                            </m:r>
+                            <m:sSub>
+                              <m:sSubPr>
                                 <m:ctrlPr>
                                   <w:rPr>
                                     <w:rFonts w:ascii="Cambria Math" w:hAnsi="Cambria Math" w:cs="Times New Roman"/>
@@ -515,7 +435,7 @@
                                     <w:szCs w:val="24"/>
                                   </w:rPr>
                                 </m:ctrlPr>
-                              </m:dPr>
+                              </m:sSubPr>
                               <m:e>
                                 <m:r>
                                   <w:rPr>
@@ -523,10 +443,12 @@
                                     <w:sz w:val="24"/>
                                     <w:szCs w:val="24"/>
                                   </w:rPr>
-                                  <m:t xml:space="preserve"> -8, 3941</m:t>
+                                  <m:t>6</m:t>
                                 </m:r>
-                                <m:sSub>
-                                  <m:sSubPr>
+                              </m:e>
+                              <m:sub>
+                                <m:d>
+                                  <m:dPr>
                                     <m:ctrlPr>
                                       <w:rPr>
                                         <w:rFonts w:ascii="Cambria Math" w:hAnsi="Cambria Math" w:cs="Times New Roman"/>
@@ -535,7 +457,7 @@
                                         <w:szCs w:val="24"/>
                                       </w:rPr>
                                     </m:ctrlPr>
-                                  </m:sSubPr>
+                                  </m:dPr>
                                   <m:e>
                                     <m:r>
                                       <w:rPr>
@@ -543,12 +465,10 @@
                                         <w:sz w:val="24"/>
                                         <w:szCs w:val="24"/>
                                       </w:rPr>
-                                      <m:t>6</m:t>
+                                      <m:t xml:space="preserve">n= </m:t>
                                     </m:r>
-                                  </m:e>
-                                  <m:sub>
-                                    <m:d>
-                                      <m:dPr>
+                                    <m:func>
+                                      <m:funcPr>
                                         <m:ctrlPr>
                                           <w:rPr>
                                             <w:rFonts w:ascii="Cambria Math" w:hAnsi="Cambria Math" w:cs="Times New Roman"/>
@@ -557,18 +477,10 @@
                                             <w:szCs w:val="24"/>
                                           </w:rPr>
                                         </m:ctrlPr>
-                                      </m:dPr>
-                                      <m:e>
-                                        <m:r>
-                                          <w:rPr>
-                                            <w:rFonts w:ascii="Cambria Math" w:hAnsi="Cambria Math" w:cs="Times New Roman"/>
-                                            <w:sz w:val="24"/>
-                                            <w:szCs w:val="24"/>
-                                          </w:rPr>
-                                          <m:t xml:space="preserve">n= </m:t>
-                                        </m:r>
-                                        <m:func>
-                                          <m:funcPr>
+                                      </m:funcPr>
+                                      <m:fName>
+                                        <m:limLow>
+                                          <m:limLowPr>
                                             <m:ctrlPr>
                                               <w:rPr>
                                                 <w:rFonts w:ascii="Cambria Math" w:hAnsi="Cambria Math" w:cs="Times New Roman"/>
@@ -577,59 +489,21 @@
                                                 <w:szCs w:val="24"/>
                                               </w:rPr>
                                             </m:ctrlPr>
-                                          </m:funcPr>
-                                          <m:fName>
-                                            <m:limLow>
-                                              <m:limLowPr>
-                                                <m:ctrlPr>
-                                                  <w:rPr>
-                                                    <w:rFonts w:ascii="Cambria Math" w:hAnsi="Cambria Math" w:cs="Times New Roman"/>
-                                                    <w:i/>
-                                                    <w:sz w:val="24"/>
-                                                    <w:szCs w:val="24"/>
-                                                  </w:rPr>
-                                                </m:ctrlPr>
-                                              </m:limLowPr>
-                                              <m:e>
-                                                <m:r>
-                                                  <m:rPr>
-                                                    <m:sty m:val="p"/>
-                                                  </m:rPr>
-                                                  <w:rPr>
-                                                    <w:rFonts w:ascii="Cambria Math" w:hAnsi="Cambria Math" w:cs="Times New Roman"/>
-                                                    <w:sz w:val="24"/>
-                                                    <w:szCs w:val="24"/>
-                                                  </w:rPr>
-                                                  <m:t>lim</m:t>
-                                                </m:r>
-                                              </m:e>
-                                              <m:lim>
-                                                <m:d>
-                                                  <m:dPr>
-                                                    <m:ctrlPr>
-                                                      <w:rPr>
-                                                        <w:rFonts w:ascii="Cambria Math" w:hAnsi="Cambria Math" w:cs="Times New Roman"/>
-                                                        <w:i/>
-                                                        <w:sz w:val="24"/>
-                                                        <w:szCs w:val="24"/>
-                                                      </w:rPr>
-                                                    </m:ctrlPr>
-                                                  </m:dPr>
-                                                  <m:e>
-                                                    <m:r>
-                                                      <w:rPr>
-                                                        <w:rFonts w:ascii="Cambria Math" w:hAnsi="Cambria Math" w:cs="Times New Roman"/>
-                                                        <w:sz w:val="24"/>
-                                                        <w:szCs w:val="24"/>
-                                                      </w:rPr>
-                                                      <m:t>n → ∞</m:t>
-                                                    </m:r>
-                                                  </m:e>
-                                                </m:d>
-                                              </m:lim>
-                                            </m:limLow>
-                                          </m:fName>
+                                          </m:limLowPr>
                                           <m:e>
+                                            <m:r>
+                                              <m:rPr>
+                                                <m:sty m:val="p"/>
+                                              </m:rPr>
+                                              <w:rPr>
+                                                <w:rFonts w:ascii="Cambria Math" w:hAnsi="Cambria Math" w:cs="Times New Roman"/>
+                                                <w:sz w:val="24"/>
+                                                <w:szCs w:val="24"/>
+                                              </w:rPr>
+                                              <m:t>lim</m:t>
+                                            </m:r>
+                                          </m:e>
+                                          <m:lim>
                                             <m:d>
                                               <m:dPr>
                                                 <m:ctrlPr>
@@ -648,28 +522,52 @@
                                                     <w:sz w:val="24"/>
                                                     <w:szCs w:val="24"/>
                                                   </w:rPr>
-                                                  <m:t>6</m:t>
+                                                  <m:t>n → ∞</m:t>
                                                 </m:r>
                                               </m:e>
                                             </m:d>
+                                          </m:lim>
+                                        </m:limLow>
+                                      </m:fName>
+                                      <m:e>
+                                        <m:d>
+                                          <m:dPr>
+                                            <m:ctrlPr>
+                                              <w:rPr>
+                                                <w:rFonts w:ascii="Cambria Math" w:hAnsi="Cambria Math" w:cs="Times New Roman"/>
+                                                <w:i/>
+                                                <w:sz w:val="24"/>
+                                                <w:szCs w:val="24"/>
+                                              </w:rPr>
+                                            </m:ctrlPr>
+                                          </m:dPr>
+                                          <m:e>
+                                            <m:r>
+                                              <w:rPr>
+                                                <w:rFonts w:ascii="Cambria Math" w:hAnsi="Cambria Math" w:cs="Times New Roman"/>
+                                                <w:sz w:val="24"/>
+                                                <w:szCs w:val="24"/>
+                                              </w:rPr>
+                                              <m:t>6</m:t>
+                                            </m:r>
                                           </m:e>
-                                        </m:func>
+                                        </m:d>
                                       </m:e>
-                                    </m:d>
-                                  </m:sub>
-                                </m:sSub>
-                              </m:e>
-                            </m:d>
-                            <m:r>
-                              <w:rPr>
-                                <w:rFonts w:ascii="Cambria Math" w:hAnsi="Cambria Math" w:cs="Times New Roman"/>
-                                <w:sz w:val="24"/>
-                                <w:szCs w:val="24"/>
-                              </w:rPr>
-                              <m:t>%</m:t>
-                            </m:r>
+                                    </m:func>
+                                  </m:e>
+                                </m:d>
+                              </m:sub>
+                            </m:sSub>
                           </m:e>
                         </m:d>
+                        <m:r>
+                          <w:rPr>
+                            <w:rFonts w:ascii="Cambria Math" w:hAnsi="Cambria Math" w:cs="Times New Roman"/>
+                            <w:sz w:val="24"/>
+                            <w:szCs w:val="24"/>
+                          </w:rPr>
+                          <m:t>%</m:t>
+                        </m:r>
                       </m:e>
                     </m:d>
                   </m:lim>
@@ -785,8 +683,6 @@
                 </m:r>
                 <m:d>
                   <m:dPr>
-                    <m:begChr m:val="["/>
-                    <m:endChr m:val="]"/>
                     <m:ctrlPr>
                       <w:rPr>
                         <w:rFonts w:ascii="Cambria Math" w:hAnsi="Cambria Math" w:cs="Times New Roman"/>
@@ -797,8 +693,16 @@
                     </m:ctrlPr>
                   </m:dPr>
                   <m:e>
-                    <m:d>
-                      <m:dPr>
+                    <m:r>
+                      <w:rPr>
+                        <w:rFonts w:ascii="Cambria Math" w:hAnsi="Cambria Math" w:cs="Times New Roman"/>
+                        <w:sz w:val="24"/>
+                        <w:szCs w:val="24"/>
+                      </w:rPr>
+                      <m:t xml:space="preserve"> -8, 3941</m:t>
+                    </m:r>
+                    <m:sSub>
+                      <m:sSubPr>
                         <m:ctrlPr>
                           <w:rPr>
                             <w:rFonts w:ascii="Cambria Math" w:hAnsi="Cambria Math" w:cs="Times New Roman"/>
@@ -807,7 +711,7 @@
                             <w:szCs w:val="24"/>
                           </w:rPr>
                         </m:ctrlPr>
-                      </m:dPr>
+                      </m:sSubPr>
                       <m:e>
                         <m:r>
                           <w:rPr>
@@ -815,10 +719,12 @@
                             <w:sz w:val="24"/>
                             <w:szCs w:val="24"/>
                           </w:rPr>
-                          <m:t xml:space="preserve"> -8, 3941</m:t>
+                          <m:t>6</m:t>
                         </m:r>
-                        <m:sSub>
-                          <m:sSubPr>
+                      </m:e>
+                      <m:sub>
+                        <m:d>
+                          <m:dPr>
                             <m:ctrlPr>
                               <w:rPr>
                                 <w:rFonts w:ascii="Cambria Math" w:hAnsi="Cambria Math" w:cs="Times New Roman"/>
@@ -827,7 +733,7 @@
                                 <w:szCs w:val="24"/>
                               </w:rPr>
                             </m:ctrlPr>
-                          </m:sSubPr>
+                          </m:dPr>
                           <m:e>
                             <m:r>
                               <w:rPr>
@@ -835,12 +741,10 @@
                                 <w:sz w:val="24"/>
                                 <w:szCs w:val="24"/>
                               </w:rPr>
-                              <m:t>6</m:t>
+                              <m:t xml:space="preserve">n= </m:t>
                             </m:r>
-                          </m:e>
-                          <m:sub>
-                            <m:d>
-                              <m:dPr>
+                            <m:func>
+                              <m:funcPr>
                                 <m:ctrlPr>
                                   <w:rPr>
                                     <w:rFonts w:ascii="Cambria Math" w:hAnsi="Cambria Math" w:cs="Times New Roman"/>
@@ -849,18 +753,10 @@
                                     <w:szCs w:val="24"/>
                                   </w:rPr>
                                 </m:ctrlPr>
-                              </m:dPr>
-                              <m:e>
-                                <m:r>
-                                  <w:rPr>
-                                    <w:rFonts w:ascii="Cambria Math" w:hAnsi="Cambria Math" w:cs="Times New Roman"/>
-                                    <w:sz w:val="24"/>
-                                    <w:szCs w:val="24"/>
-                                  </w:rPr>
-                                  <m:t xml:space="preserve">n= </m:t>
-                                </m:r>
-                                <m:func>
-                                  <m:funcPr>
+                              </m:funcPr>
+                              <m:fName>
+                                <m:limLow>
+                                  <m:limLowPr>
                                     <m:ctrlPr>
                                       <w:rPr>
                                         <w:rFonts w:ascii="Cambria Math" w:hAnsi="Cambria Math" w:cs="Times New Roman"/>
@@ -869,59 +765,21 @@
                                         <w:szCs w:val="24"/>
                                       </w:rPr>
                                     </m:ctrlPr>
-                                  </m:funcPr>
-                                  <m:fName>
-                                    <m:limLow>
-                                      <m:limLowPr>
-                                        <m:ctrlPr>
-                                          <w:rPr>
-                                            <w:rFonts w:ascii="Cambria Math" w:hAnsi="Cambria Math" w:cs="Times New Roman"/>
-                                            <w:i/>
-                                            <w:sz w:val="24"/>
-                                            <w:szCs w:val="24"/>
-                                          </w:rPr>
-                                        </m:ctrlPr>
-                                      </m:limLowPr>
-                                      <m:e>
-                                        <m:r>
-                                          <m:rPr>
-                                            <m:sty m:val="p"/>
-                                          </m:rPr>
-                                          <w:rPr>
-                                            <w:rFonts w:ascii="Cambria Math" w:hAnsi="Cambria Math" w:cs="Times New Roman"/>
-                                            <w:sz w:val="24"/>
-                                            <w:szCs w:val="24"/>
-                                          </w:rPr>
-                                          <m:t>lim</m:t>
-                                        </m:r>
-                                      </m:e>
-                                      <m:lim>
-                                        <m:d>
-                                          <m:dPr>
-                                            <m:ctrlPr>
-                                              <w:rPr>
-                                                <w:rFonts w:ascii="Cambria Math" w:hAnsi="Cambria Math" w:cs="Times New Roman"/>
-                                                <w:i/>
-                                                <w:sz w:val="24"/>
-                                                <w:szCs w:val="24"/>
-                                              </w:rPr>
-                                            </m:ctrlPr>
-                                          </m:dPr>
-                                          <m:e>
-                                            <m:r>
-                                              <w:rPr>
-                                                <w:rFonts w:ascii="Cambria Math" w:hAnsi="Cambria Math" w:cs="Times New Roman"/>
-                                                <w:sz w:val="24"/>
-                                                <w:szCs w:val="24"/>
-                                              </w:rPr>
-                                              <m:t>n → ∞</m:t>
-                                            </m:r>
-                                          </m:e>
-                                        </m:d>
-                                      </m:lim>
-                                    </m:limLow>
-                                  </m:fName>
+                                  </m:limLowPr>
                                   <m:e>
+                                    <m:r>
+                                      <m:rPr>
+                                        <m:sty m:val="p"/>
+                                      </m:rPr>
+                                      <w:rPr>
+                                        <w:rFonts w:ascii="Cambria Math" w:hAnsi="Cambria Math" w:cs="Times New Roman"/>
+                                        <w:sz w:val="24"/>
+                                        <w:szCs w:val="24"/>
+                                      </w:rPr>
+                                      <m:t>lim</m:t>
+                                    </m:r>
+                                  </m:e>
+                                  <m:lim>
                                     <m:d>
                                       <m:dPr>
                                         <m:ctrlPr>
@@ -940,28 +798,52 @@
                                             <w:sz w:val="24"/>
                                             <w:szCs w:val="24"/>
                                           </w:rPr>
-                                          <m:t>6</m:t>
+                                          <m:t>n → ∞</m:t>
                                         </m:r>
                                       </m:e>
                                     </m:d>
+                                  </m:lim>
+                                </m:limLow>
+                              </m:fName>
+                              <m:e>
+                                <m:d>
+                                  <m:dPr>
+                                    <m:ctrlPr>
+                                      <w:rPr>
+                                        <w:rFonts w:ascii="Cambria Math" w:hAnsi="Cambria Math" w:cs="Times New Roman"/>
+                                        <w:i/>
+                                        <w:sz w:val="24"/>
+                                        <w:szCs w:val="24"/>
+                                      </w:rPr>
+                                    </m:ctrlPr>
+                                  </m:dPr>
+                                  <m:e>
+                                    <m:r>
+                                      <w:rPr>
+                                        <w:rFonts w:ascii="Cambria Math" w:hAnsi="Cambria Math" w:cs="Times New Roman"/>
+                                        <w:sz w:val="24"/>
+                                        <w:szCs w:val="24"/>
+                                      </w:rPr>
+                                      <m:t>6</m:t>
+                                    </m:r>
                                   </m:e>
-                                </m:func>
+                                </m:d>
                               </m:e>
-                            </m:d>
-                          </m:sub>
-                        </m:sSub>
-                      </m:e>
-                    </m:d>
-                    <m:r>
-                      <w:rPr>
-                        <w:rFonts w:ascii="Cambria Math" w:hAnsi="Cambria Math" w:cs="Times New Roman"/>
-                        <w:sz w:val="24"/>
-                        <w:szCs w:val="24"/>
-                      </w:rPr>
-                      <m:t>%</m:t>
-                    </m:r>
+                            </m:func>
+                          </m:e>
+                        </m:d>
+                      </m:sub>
+                    </m:sSub>
                   </m:e>
                 </m:d>
+                <m:r>
+                  <w:rPr>
+                    <w:rFonts w:ascii="Cambria Math" w:hAnsi="Cambria Math" w:cs="Times New Roman"/>
+                    <w:sz w:val="24"/>
+                    <w:szCs w:val="24"/>
+                  </w:rPr>
+                  <m:t>%</m:t>
+                </m:r>
               </m:e>
             </m:d>
           </m:sub>
@@ -1026,8 +908,6 @@
                         </m:r>
                         <m:d>
                           <m:dPr>
-                            <m:begChr m:val="["/>
-                            <m:endChr m:val="]"/>
                             <m:ctrlPr>
                               <w:rPr>
                                 <w:rFonts w:ascii="Cambria Math" w:hAnsi="Cambria Math" w:cs="Times New Roman"/>
@@ -1038,8 +918,16 @@
                             </m:ctrlPr>
                           </m:dPr>
                           <m:e>
-                            <m:d>
-                              <m:dPr>
+                            <m:r>
+                              <w:rPr>
+                                <w:rFonts w:ascii="Cambria Math" w:hAnsi="Cambria Math" w:cs="Times New Roman"/>
+                                <w:sz w:val="24"/>
+                                <w:szCs w:val="24"/>
+                              </w:rPr>
+                              <m:t xml:space="preserve"> -8, 3941</m:t>
+                            </m:r>
+                            <m:sSub>
+                              <m:sSubPr>
                                 <m:ctrlPr>
                                   <w:rPr>
                                     <w:rFonts w:ascii="Cambria Math" w:hAnsi="Cambria Math" w:cs="Times New Roman"/>
@@ -1048,7 +936,7 @@
                                     <w:szCs w:val="24"/>
                                   </w:rPr>
                                 </m:ctrlPr>
-                              </m:dPr>
+                              </m:sSubPr>
                               <m:e>
                                 <m:r>
                                   <w:rPr>
@@ -1056,10 +944,12 @@
                                     <w:sz w:val="24"/>
                                     <w:szCs w:val="24"/>
                                   </w:rPr>
-                                  <m:t xml:space="preserve"> -8, 3941</m:t>
+                                  <m:t>6</m:t>
                                 </m:r>
-                                <m:sSub>
-                                  <m:sSubPr>
+                              </m:e>
+                              <m:sub>
+                                <m:d>
+                                  <m:dPr>
                                     <m:ctrlPr>
                                       <w:rPr>
                                         <w:rFonts w:ascii="Cambria Math" w:hAnsi="Cambria Math" w:cs="Times New Roman"/>
@@ -1068,7 +958,7 @@
                                         <w:szCs w:val="24"/>
                                       </w:rPr>
                                     </m:ctrlPr>
-                                  </m:sSubPr>
+                                  </m:dPr>
                                   <m:e>
                                     <m:r>
                                       <w:rPr>
@@ -1076,12 +966,10 @@
                                         <w:sz w:val="24"/>
                                         <w:szCs w:val="24"/>
                                       </w:rPr>
-                                      <m:t>6</m:t>
+                                      <m:t xml:space="preserve">n= </m:t>
                                     </m:r>
-                                  </m:e>
-                                  <m:sub>
-                                    <m:d>
-                                      <m:dPr>
+                                    <m:func>
+                                      <m:funcPr>
                                         <m:ctrlPr>
                                           <w:rPr>
                                             <w:rFonts w:ascii="Cambria Math" w:hAnsi="Cambria Math" w:cs="Times New Roman"/>
@@ -1090,18 +978,10 @@
                                             <w:szCs w:val="24"/>
                                           </w:rPr>
                                         </m:ctrlPr>
-                                      </m:dPr>
-                                      <m:e>
-                                        <m:r>
-                                          <w:rPr>
-                                            <w:rFonts w:ascii="Cambria Math" w:hAnsi="Cambria Math" w:cs="Times New Roman"/>
-                                            <w:sz w:val="24"/>
-                                            <w:szCs w:val="24"/>
-                                          </w:rPr>
-                                          <m:t xml:space="preserve">n= </m:t>
-                                        </m:r>
-                                        <m:func>
-                                          <m:funcPr>
+                                      </m:funcPr>
+                                      <m:fName>
+                                        <m:limLow>
+                                          <m:limLowPr>
                                             <m:ctrlPr>
                                               <w:rPr>
                                                 <w:rFonts w:ascii="Cambria Math" w:hAnsi="Cambria Math" w:cs="Times New Roman"/>
@@ -1110,59 +990,21 @@
                                                 <w:szCs w:val="24"/>
                                               </w:rPr>
                                             </m:ctrlPr>
-                                          </m:funcPr>
-                                          <m:fName>
-                                            <m:limLow>
-                                              <m:limLowPr>
-                                                <m:ctrlPr>
-                                                  <w:rPr>
-                                                    <w:rFonts w:ascii="Cambria Math" w:hAnsi="Cambria Math" w:cs="Times New Roman"/>
-                                                    <w:i/>
-                                                    <w:sz w:val="24"/>
-                                                    <w:szCs w:val="24"/>
-                                                  </w:rPr>
-                                                </m:ctrlPr>
-                                              </m:limLowPr>
-                                              <m:e>
-                                                <m:r>
-                                                  <m:rPr>
-                                                    <m:sty m:val="p"/>
-                                                  </m:rPr>
-                                                  <w:rPr>
-                                                    <w:rFonts w:ascii="Cambria Math" w:hAnsi="Cambria Math" w:cs="Times New Roman"/>
-                                                    <w:sz w:val="24"/>
-                                                    <w:szCs w:val="24"/>
-                                                  </w:rPr>
-                                                  <m:t>lim</m:t>
-                                                </m:r>
-                                              </m:e>
-                                              <m:lim>
-                                                <m:d>
-                                                  <m:dPr>
-                                                    <m:ctrlPr>
-                                                      <w:rPr>
-                                                        <w:rFonts w:ascii="Cambria Math" w:hAnsi="Cambria Math" w:cs="Times New Roman"/>
-                                                        <w:i/>
-                                                        <w:sz w:val="24"/>
-                                                        <w:szCs w:val="24"/>
-                                                      </w:rPr>
-                                                    </m:ctrlPr>
-                                                  </m:dPr>
-                                                  <m:e>
-                                                    <m:r>
-                                                      <w:rPr>
-                                                        <w:rFonts w:ascii="Cambria Math" w:hAnsi="Cambria Math" w:cs="Times New Roman"/>
-                                                        <w:sz w:val="24"/>
-                                                        <w:szCs w:val="24"/>
-                                                      </w:rPr>
-                                                      <m:t>n → ∞</m:t>
-                                                    </m:r>
-                                                  </m:e>
-                                                </m:d>
-                                              </m:lim>
-                                            </m:limLow>
-                                          </m:fName>
+                                          </m:limLowPr>
                                           <m:e>
+                                            <m:r>
+                                              <m:rPr>
+                                                <m:sty m:val="p"/>
+                                              </m:rPr>
+                                              <w:rPr>
+                                                <w:rFonts w:ascii="Cambria Math" w:hAnsi="Cambria Math" w:cs="Times New Roman"/>
+                                                <w:sz w:val="24"/>
+                                                <w:szCs w:val="24"/>
+                                              </w:rPr>
+                                              <m:t>lim</m:t>
+                                            </m:r>
+                                          </m:e>
+                                          <m:lim>
                                             <m:d>
                                               <m:dPr>
                                                 <m:ctrlPr>
@@ -1181,28 +1023,52 @@
                                                     <w:sz w:val="24"/>
                                                     <w:szCs w:val="24"/>
                                                   </w:rPr>
-                                                  <m:t>6</m:t>
+                                                  <m:t>n → ∞</m:t>
                                                 </m:r>
                                               </m:e>
                                             </m:d>
+                                          </m:lim>
+                                        </m:limLow>
+                                      </m:fName>
+                                      <m:e>
+                                        <m:d>
+                                          <m:dPr>
+                                            <m:ctrlPr>
+                                              <w:rPr>
+                                                <w:rFonts w:ascii="Cambria Math" w:hAnsi="Cambria Math" w:cs="Times New Roman"/>
+                                                <w:i/>
+                                                <w:sz w:val="24"/>
+                                                <w:szCs w:val="24"/>
+                                              </w:rPr>
+                                            </m:ctrlPr>
+                                          </m:dPr>
+                                          <m:e>
+                                            <m:r>
+                                              <w:rPr>
+                                                <w:rFonts w:ascii="Cambria Math" w:hAnsi="Cambria Math" w:cs="Times New Roman"/>
+                                                <w:sz w:val="24"/>
+                                                <w:szCs w:val="24"/>
+                                              </w:rPr>
+                                              <m:t>6</m:t>
+                                            </m:r>
                                           </m:e>
-                                        </m:func>
+                                        </m:d>
                                       </m:e>
-                                    </m:d>
-                                  </m:sub>
-                                </m:sSub>
-                              </m:e>
-                            </m:d>
-                            <m:r>
-                              <w:rPr>
-                                <w:rFonts w:ascii="Cambria Math" w:hAnsi="Cambria Math" w:cs="Times New Roman"/>
-                                <w:sz w:val="24"/>
-                                <w:szCs w:val="24"/>
-                              </w:rPr>
-                              <m:t>%</m:t>
-                            </m:r>
+                                    </m:func>
+                                  </m:e>
+                                </m:d>
+                              </m:sub>
+                            </m:sSub>
                           </m:e>
                         </m:d>
+                        <m:r>
+                          <w:rPr>
+                            <w:rFonts w:ascii="Cambria Math" w:hAnsi="Cambria Math" w:cs="Times New Roman"/>
+                            <w:sz w:val="24"/>
+                            <w:szCs w:val="24"/>
+                          </w:rPr>
+                          <m:t>%</m:t>
+                        </m:r>
                       </m:e>
                     </m:d>
                   </m:lim>

</xml_diff>

<commit_message>
Rumus Perpangkatan Universal || [23:48 (W . I . B (Waktu Indonesia bagian Barat)), 31/08/2026], Jakarta Barat, Daerah Khusus Ibukota (DKI) Jakarta, Indonesia || #LAWANPEMERINTAHKORUPPENINDASRAKYATINDONESIADENGANPENGETAHUAN
Rumus Perpangkatan Universal || [23:48 (W . I . B (Waktu Indonesia bagian Barat)), 31/08/2026], Jakarta Barat, Daerah Khusus Ibukota (DKI) Jakarta, Indonesia || #LAWANPEMERINTAHKORUPPENINDASRAKYATINDONESIADENGANPENGETAHUAN
</commit_message>
<xml_diff>
--- a/Rumus Perpangkatan Universal 4.0.docx
+++ b/Rumus Perpangkatan Universal 4.0.docx
@@ -13,13 +13,41 @@
           <w:lang w:val="id-ID"/>
         </w:rPr>
       </w:pPr>
+      <w:proofErr w:type="spellStart"/>
       <w:r>
         <w:rPr>
           <w:rFonts w:ascii="Times New Roman" w:eastAsiaTheme="minorEastAsia" w:hAnsi="Times New Roman" w:cs="Times New Roman"/>
           <w:sz w:val="24"/>
           <w:szCs w:val="24"/>
         </w:rPr>
-        <w:t xml:space="preserve">Rumus Perpangkatan Universal </w:t>
+        <w:t>Rumus</w:t>
+      </w:r>
+      <w:proofErr w:type="spellEnd"/>
+      <w:r>
+        <w:rPr>
+          <w:rFonts w:ascii="Times New Roman" w:eastAsiaTheme="minorEastAsia" w:hAnsi="Times New Roman" w:cs="Times New Roman"/>
+          <w:sz w:val="24"/>
+          <w:szCs w:val="24"/>
+        </w:rPr>
+        <w:t xml:space="preserve"> </w:t>
+      </w:r>
+      <w:proofErr w:type="spellStart"/>
+      <w:r>
+        <w:rPr>
+          <w:rFonts w:ascii="Times New Roman" w:eastAsiaTheme="minorEastAsia" w:hAnsi="Times New Roman" w:cs="Times New Roman"/>
+          <w:sz w:val="24"/>
+          <w:szCs w:val="24"/>
+        </w:rPr>
+        <w:t>Perpangkatan</w:t>
+      </w:r>
+      <w:proofErr w:type="spellEnd"/>
+      <w:r>
+        <w:rPr>
+          <w:rFonts w:ascii="Times New Roman" w:eastAsiaTheme="minorEastAsia" w:hAnsi="Times New Roman" w:cs="Times New Roman"/>
+          <w:sz w:val="24"/>
+          <w:szCs w:val="24"/>
+        </w:rPr>
+        <w:t xml:space="preserve"> Universal </w:t>
       </w:r>
       <w:r>
         <w:rPr>
@@ -49,6 +77,7 @@
           <w:lang w:val="id-ID"/>
         </w:rPr>
       </w:pPr>
+      <w:proofErr w:type="spellStart"/>
       <w:r>
         <w:rPr>
           <w:rFonts w:ascii="Times New Roman" w:eastAsiaTheme="minorEastAsia" w:hAnsi="Times New Roman" w:cs="Times New Roman"/>
@@ -56,7 +85,37 @@
           <w:szCs w:val="24"/>
           <w:lang w:val="id-ID"/>
         </w:rPr>
-        <w:t>by : Samuel Hasiholan Omega Purba, S. Tr. T.</w:t>
+        <w:t>by</w:t>
+      </w:r>
+      <w:proofErr w:type="spellEnd"/>
+      <w:r>
+        <w:rPr>
+          <w:rFonts w:ascii="Times New Roman" w:eastAsiaTheme="minorEastAsia" w:hAnsi="Times New Roman" w:cs="Times New Roman"/>
+          <w:sz w:val="24"/>
+          <w:szCs w:val="24"/>
+          <w:lang w:val="id-ID"/>
+        </w:rPr>
+        <w:t xml:space="preserve"> : Samuel Hasiholan Omega Purba, S. </w:t>
+      </w:r>
+      <w:proofErr w:type="spellStart"/>
+      <w:r>
+        <w:rPr>
+          <w:rFonts w:ascii="Times New Roman" w:eastAsiaTheme="minorEastAsia" w:hAnsi="Times New Roman" w:cs="Times New Roman"/>
+          <w:sz w:val="24"/>
+          <w:szCs w:val="24"/>
+          <w:lang w:val="id-ID"/>
+        </w:rPr>
+        <w:t>Tr</w:t>
+      </w:r>
+      <w:proofErr w:type="spellEnd"/>
+      <w:r>
+        <w:rPr>
+          <w:rFonts w:ascii="Times New Roman" w:eastAsiaTheme="minorEastAsia" w:hAnsi="Times New Roman" w:cs="Times New Roman"/>
+          <w:sz w:val="24"/>
+          <w:szCs w:val="24"/>
+          <w:lang w:val="id-ID"/>
+        </w:rPr>
+        <w:t>. T.</w:t>
       </w:r>
     </w:p>
     <w:p>
@@ -91,6 +150,7 @@
           <w:lang w:val="id-ID"/>
         </w:rPr>
       </w:pPr>
+      <w:proofErr w:type="spellStart"/>
       <w:r>
         <w:rPr>
           <w:rFonts w:ascii="Times New Roman" w:eastAsiaTheme="minorEastAsia" w:hAnsi="Times New Roman" w:cs="Times New Roman"/>
@@ -98,7 +158,17 @@
           <w:szCs w:val="24"/>
           <w:lang w:val="id-ID"/>
         </w:rPr>
-        <w:t>Prodi Teknik Robotika dan Kecerdasan buatan</w:t>
+        <w:t>Prodi</w:t>
+      </w:r>
+      <w:proofErr w:type="spellEnd"/>
+      <w:r>
+        <w:rPr>
+          <w:rFonts w:ascii="Times New Roman" w:eastAsiaTheme="minorEastAsia" w:hAnsi="Times New Roman" w:cs="Times New Roman"/>
+          <w:sz w:val="24"/>
+          <w:szCs w:val="24"/>
+          <w:lang w:val="id-ID"/>
+        </w:rPr>
+        <w:t xml:space="preserve"> Teknik Robotika dan Kecerdasan buatan</w:t>
       </w:r>
     </w:p>
     <w:p>
@@ -178,10 +248,10 @@
                     <w:sz w:val="24"/>
                     <w:szCs w:val="24"/>
                   </w:rPr>
-                  <m:t xml:space="preserve">x = ζ → </m:t>
+                  <m:t xml:space="preserve">x → ζ = 8,39416  .   .   .    </m:t>
                 </m:r>
-                <m:d>
-                  <m:dPr>
+                <m:sSub>
+                  <m:sSubPr>
                     <m:ctrlPr>
                       <w:rPr>
                         <w:rFonts w:ascii="Cambria Math" w:hAnsi="Cambria Math" w:cs="Times New Roman"/>
@@ -190,7 +260,7 @@
                         <w:szCs w:val="24"/>
                       </w:rPr>
                     </m:ctrlPr>
-                  </m:dPr>
+                  </m:sSubPr>
                   <m:e>
                     <m:r>
                       <w:rPr>
@@ -198,143 +268,20 @@
                         <w:sz w:val="24"/>
                         <w:szCs w:val="24"/>
                       </w:rPr>
-                      <m:t xml:space="preserve"> -8, 3941</m:t>
+                      <m:t>6</m:t>
                     </m:r>
-                    <m:sSub>
-                      <m:sSubPr>
-                        <m:ctrlPr>
-                          <w:rPr>
-                            <w:rFonts w:ascii="Cambria Math" w:hAnsi="Cambria Math" w:cs="Times New Roman"/>
-                            <w:i/>
-                            <w:sz w:val="24"/>
-                            <w:szCs w:val="24"/>
-                          </w:rPr>
-                        </m:ctrlPr>
-                      </m:sSubPr>
-                      <m:e>
-                        <m:r>
-                          <w:rPr>
-                            <w:rFonts w:ascii="Cambria Math" w:hAnsi="Cambria Math" w:cs="Times New Roman"/>
-                            <w:sz w:val="24"/>
-                            <w:szCs w:val="24"/>
-                          </w:rPr>
-                          <m:t>6</m:t>
-                        </m:r>
-                      </m:e>
-                      <m:sub>
-                        <m:d>
-                          <m:dPr>
-                            <m:ctrlPr>
-                              <w:rPr>
-                                <w:rFonts w:ascii="Cambria Math" w:hAnsi="Cambria Math" w:cs="Times New Roman"/>
-                                <w:i/>
-                                <w:sz w:val="24"/>
-                                <w:szCs w:val="24"/>
-                              </w:rPr>
-                            </m:ctrlPr>
-                          </m:dPr>
-                          <m:e>
-                            <m:r>
-                              <w:rPr>
-                                <w:rFonts w:ascii="Cambria Math" w:hAnsi="Cambria Math" w:cs="Times New Roman"/>
-                                <w:sz w:val="24"/>
-                                <w:szCs w:val="24"/>
-                              </w:rPr>
-                              <m:t xml:space="preserve">n= </m:t>
-                            </m:r>
-                            <m:func>
-                              <m:funcPr>
-                                <m:ctrlPr>
-                                  <w:rPr>
-                                    <w:rFonts w:ascii="Cambria Math" w:hAnsi="Cambria Math" w:cs="Times New Roman"/>
-                                    <w:i/>
-                                    <w:sz w:val="24"/>
-                                    <w:szCs w:val="24"/>
-                                  </w:rPr>
-                                </m:ctrlPr>
-                              </m:funcPr>
-                              <m:fName>
-                                <m:limLow>
-                                  <m:limLowPr>
-                                    <m:ctrlPr>
-                                      <w:rPr>
-                                        <w:rFonts w:ascii="Cambria Math" w:hAnsi="Cambria Math" w:cs="Times New Roman"/>
-                                        <w:i/>
-                                        <w:sz w:val="24"/>
-                                        <w:szCs w:val="24"/>
-                                      </w:rPr>
-                                    </m:ctrlPr>
-                                  </m:limLowPr>
-                                  <m:e>
-                                    <m:r>
-                                      <m:rPr>
-                                        <m:sty m:val="p"/>
-                                      </m:rPr>
-                                      <w:rPr>
-                                        <w:rFonts w:ascii="Cambria Math" w:hAnsi="Cambria Math" w:cs="Times New Roman"/>
-                                        <w:sz w:val="24"/>
-                                        <w:szCs w:val="24"/>
-                                      </w:rPr>
-                                      <m:t>lim</m:t>
-                                    </m:r>
-                                  </m:e>
-                                  <m:lim>
-                                    <m:d>
-                                      <m:dPr>
-                                        <m:ctrlPr>
-                                          <w:rPr>
-                                            <w:rFonts w:ascii="Cambria Math" w:hAnsi="Cambria Math" w:cs="Times New Roman"/>
-                                            <w:i/>
-                                            <w:sz w:val="24"/>
-                                            <w:szCs w:val="24"/>
-                                          </w:rPr>
-                                        </m:ctrlPr>
-                                      </m:dPr>
-                                      <m:e>
-                                        <m:r>
-                                          <w:rPr>
-                                            <w:rFonts w:ascii="Cambria Math" w:hAnsi="Cambria Math" w:cs="Times New Roman"/>
-                                            <w:sz w:val="24"/>
-                                            <w:szCs w:val="24"/>
-                                          </w:rPr>
-                                          <m:t>n → ∞</m:t>
-                                        </m:r>
-                                      </m:e>
-                                    </m:d>
-                                  </m:lim>
-                                </m:limLow>
-                              </m:fName>
-                              <m:e>
-                                <m:d>
-                                  <m:dPr>
-                                    <m:ctrlPr>
-                                      <w:rPr>
-                                        <w:rFonts w:ascii="Cambria Math" w:hAnsi="Cambria Math" w:cs="Times New Roman"/>
-                                        <w:i/>
-                                        <w:sz w:val="24"/>
-                                        <w:szCs w:val="24"/>
-                                      </w:rPr>
-                                    </m:ctrlPr>
-                                  </m:dPr>
-                                  <m:e>
-                                    <m:r>
-                                      <w:rPr>
-                                        <w:rFonts w:ascii="Cambria Math" w:hAnsi="Cambria Math" w:cs="Times New Roman"/>
-                                        <w:sz w:val="24"/>
-                                        <w:szCs w:val="24"/>
-                                      </w:rPr>
-                                      <m:t>6</m:t>
-                                    </m:r>
-                                  </m:e>
-                                </m:d>
-                              </m:e>
-                            </m:func>
-                          </m:e>
-                        </m:d>
-                      </m:sub>
-                    </m:sSub>
                   </m:e>
-                </m:d>
+                  <m:sub>
+                    <m:r>
+                      <w:rPr>
+                        <w:rFonts w:ascii="Cambria Math" w:hAnsi="Cambria Math" w:cs="Times New Roman"/>
+                        <w:sz w:val="24"/>
+                        <w:szCs w:val="24"/>
+                      </w:rPr>
+                      <m:t>n</m:t>
+                    </m:r>
+                  </m:sub>
+                </m:sSub>
                 <m:r>
                   <w:rPr>
                     <w:rFonts w:ascii="Cambria Math" w:hAnsi="Cambria Math" w:cs="Times New Roman"/>
@@ -403,10 +350,10 @@
                             <w:sz w:val="24"/>
                             <w:szCs w:val="24"/>
                           </w:rPr>
-                          <m:t xml:space="preserve">x = ζ → </m:t>
+                          <m:t xml:space="preserve">x → ζ = 8,39416  .   .   .    </m:t>
                         </m:r>
-                        <m:d>
-                          <m:dPr>
+                        <m:sSub>
+                          <m:sSubPr>
                             <m:ctrlPr>
                               <w:rPr>
                                 <w:rFonts w:ascii="Cambria Math" w:hAnsi="Cambria Math" w:cs="Times New Roman"/>
@@ -415,7 +362,7 @@
                                 <w:szCs w:val="24"/>
                               </w:rPr>
                             </m:ctrlPr>
-                          </m:dPr>
+                          </m:sSubPr>
                           <m:e>
                             <m:r>
                               <w:rPr>
@@ -423,143 +370,20 @@
                                 <w:sz w:val="24"/>
                                 <w:szCs w:val="24"/>
                               </w:rPr>
-                              <m:t xml:space="preserve"> -8, 3941</m:t>
+                              <m:t>6</m:t>
                             </m:r>
-                            <m:sSub>
-                              <m:sSubPr>
-                                <m:ctrlPr>
-                                  <w:rPr>
-                                    <w:rFonts w:ascii="Cambria Math" w:hAnsi="Cambria Math" w:cs="Times New Roman"/>
-                                    <w:i/>
-                                    <w:sz w:val="24"/>
-                                    <w:szCs w:val="24"/>
-                                  </w:rPr>
-                                </m:ctrlPr>
-                              </m:sSubPr>
-                              <m:e>
-                                <m:r>
-                                  <w:rPr>
-                                    <w:rFonts w:ascii="Cambria Math" w:hAnsi="Cambria Math" w:cs="Times New Roman"/>
-                                    <w:sz w:val="24"/>
-                                    <w:szCs w:val="24"/>
-                                  </w:rPr>
-                                  <m:t>6</m:t>
-                                </m:r>
-                              </m:e>
-                              <m:sub>
-                                <m:d>
-                                  <m:dPr>
-                                    <m:ctrlPr>
-                                      <w:rPr>
-                                        <w:rFonts w:ascii="Cambria Math" w:hAnsi="Cambria Math" w:cs="Times New Roman"/>
-                                        <w:i/>
-                                        <w:sz w:val="24"/>
-                                        <w:szCs w:val="24"/>
-                                      </w:rPr>
-                                    </m:ctrlPr>
-                                  </m:dPr>
-                                  <m:e>
-                                    <m:r>
-                                      <w:rPr>
-                                        <w:rFonts w:ascii="Cambria Math" w:hAnsi="Cambria Math" w:cs="Times New Roman"/>
-                                        <w:sz w:val="24"/>
-                                        <w:szCs w:val="24"/>
-                                      </w:rPr>
-                                      <m:t xml:space="preserve">n= </m:t>
-                                    </m:r>
-                                    <m:func>
-                                      <m:funcPr>
-                                        <m:ctrlPr>
-                                          <w:rPr>
-                                            <w:rFonts w:ascii="Cambria Math" w:hAnsi="Cambria Math" w:cs="Times New Roman"/>
-                                            <w:i/>
-                                            <w:sz w:val="24"/>
-                                            <w:szCs w:val="24"/>
-                                          </w:rPr>
-                                        </m:ctrlPr>
-                                      </m:funcPr>
-                                      <m:fName>
-                                        <m:limLow>
-                                          <m:limLowPr>
-                                            <m:ctrlPr>
-                                              <w:rPr>
-                                                <w:rFonts w:ascii="Cambria Math" w:hAnsi="Cambria Math" w:cs="Times New Roman"/>
-                                                <w:i/>
-                                                <w:sz w:val="24"/>
-                                                <w:szCs w:val="24"/>
-                                              </w:rPr>
-                                            </m:ctrlPr>
-                                          </m:limLowPr>
-                                          <m:e>
-                                            <m:r>
-                                              <m:rPr>
-                                                <m:sty m:val="p"/>
-                                              </m:rPr>
-                                              <w:rPr>
-                                                <w:rFonts w:ascii="Cambria Math" w:hAnsi="Cambria Math" w:cs="Times New Roman"/>
-                                                <w:sz w:val="24"/>
-                                                <w:szCs w:val="24"/>
-                                              </w:rPr>
-                                              <m:t>lim</m:t>
-                                            </m:r>
-                                          </m:e>
-                                          <m:lim>
-                                            <m:d>
-                                              <m:dPr>
-                                                <m:ctrlPr>
-                                                  <w:rPr>
-                                                    <w:rFonts w:ascii="Cambria Math" w:hAnsi="Cambria Math" w:cs="Times New Roman"/>
-                                                    <w:i/>
-                                                    <w:sz w:val="24"/>
-                                                    <w:szCs w:val="24"/>
-                                                  </w:rPr>
-                                                </m:ctrlPr>
-                                              </m:dPr>
-                                              <m:e>
-                                                <m:r>
-                                                  <w:rPr>
-                                                    <w:rFonts w:ascii="Cambria Math" w:hAnsi="Cambria Math" w:cs="Times New Roman"/>
-                                                    <w:sz w:val="24"/>
-                                                    <w:szCs w:val="24"/>
-                                                  </w:rPr>
-                                                  <m:t>n → ∞</m:t>
-                                                </m:r>
-                                              </m:e>
-                                            </m:d>
-                                          </m:lim>
-                                        </m:limLow>
-                                      </m:fName>
-                                      <m:e>
-                                        <m:d>
-                                          <m:dPr>
-                                            <m:ctrlPr>
-                                              <w:rPr>
-                                                <w:rFonts w:ascii="Cambria Math" w:hAnsi="Cambria Math" w:cs="Times New Roman"/>
-                                                <w:i/>
-                                                <w:sz w:val="24"/>
-                                                <w:szCs w:val="24"/>
-                                              </w:rPr>
-                                            </m:ctrlPr>
-                                          </m:dPr>
-                                          <m:e>
-                                            <m:r>
-                                              <w:rPr>
-                                                <w:rFonts w:ascii="Cambria Math" w:hAnsi="Cambria Math" w:cs="Times New Roman"/>
-                                                <w:sz w:val="24"/>
-                                                <w:szCs w:val="24"/>
-                                              </w:rPr>
-                                              <m:t>6</m:t>
-                                            </m:r>
-                                          </m:e>
-                                        </m:d>
-                                      </m:e>
-                                    </m:func>
-                                  </m:e>
-                                </m:d>
-                              </m:sub>
-                            </m:sSub>
                           </m:e>
-                        </m:d>
+                          <m:sub>
+                            <m:r>
+                              <w:rPr>
+                                <w:rFonts w:ascii="Cambria Math" w:hAnsi="Cambria Math" w:cs="Times New Roman"/>
+                                <w:sz w:val="24"/>
+                                <w:szCs w:val="24"/>
+                              </w:rPr>
+                              <m:t>n</m:t>
+                            </m:r>
+                          </m:sub>
+                        </m:sSub>
                         <m:r>
                           <w:rPr>
                             <w:rFonts w:ascii="Cambria Math" w:hAnsi="Cambria Math" w:cs="Times New Roman"/>
@@ -679,10 +503,10 @@
                     <w:sz w:val="24"/>
                     <w:szCs w:val="24"/>
                   </w:rPr>
-                  <m:t xml:space="preserve">x = ζ → </m:t>
+                  <m:t xml:space="preserve">x → ζ = 8,39416  .   .   .    </m:t>
                 </m:r>
-                <m:d>
-                  <m:dPr>
+                <m:sSub>
+                  <m:sSubPr>
                     <m:ctrlPr>
                       <w:rPr>
                         <w:rFonts w:ascii="Cambria Math" w:hAnsi="Cambria Math" w:cs="Times New Roman"/>
@@ -691,7 +515,7 @@
                         <w:szCs w:val="24"/>
                       </w:rPr>
                     </m:ctrlPr>
-                  </m:dPr>
+                  </m:sSubPr>
                   <m:e>
                     <m:r>
                       <w:rPr>
@@ -699,143 +523,20 @@
                         <w:sz w:val="24"/>
                         <w:szCs w:val="24"/>
                       </w:rPr>
-                      <m:t xml:space="preserve"> -8, 3941</m:t>
+                      <m:t>6</m:t>
                     </m:r>
-                    <m:sSub>
-                      <m:sSubPr>
-                        <m:ctrlPr>
-                          <w:rPr>
-                            <w:rFonts w:ascii="Cambria Math" w:hAnsi="Cambria Math" w:cs="Times New Roman"/>
-                            <w:i/>
-                            <w:sz w:val="24"/>
-                            <w:szCs w:val="24"/>
-                          </w:rPr>
-                        </m:ctrlPr>
-                      </m:sSubPr>
-                      <m:e>
-                        <m:r>
-                          <w:rPr>
-                            <w:rFonts w:ascii="Cambria Math" w:hAnsi="Cambria Math" w:cs="Times New Roman"/>
-                            <w:sz w:val="24"/>
-                            <w:szCs w:val="24"/>
-                          </w:rPr>
-                          <m:t>6</m:t>
-                        </m:r>
-                      </m:e>
-                      <m:sub>
-                        <m:d>
-                          <m:dPr>
-                            <m:ctrlPr>
-                              <w:rPr>
-                                <w:rFonts w:ascii="Cambria Math" w:hAnsi="Cambria Math" w:cs="Times New Roman"/>
-                                <w:i/>
-                                <w:sz w:val="24"/>
-                                <w:szCs w:val="24"/>
-                              </w:rPr>
-                            </m:ctrlPr>
-                          </m:dPr>
-                          <m:e>
-                            <m:r>
-                              <w:rPr>
-                                <w:rFonts w:ascii="Cambria Math" w:hAnsi="Cambria Math" w:cs="Times New Roman"/>
-                                <w:sz w:val="24"/>
-                                <w:szCs w:val="24"/>
-                              </w:rPr>
-                              <m:t xml:space="preserve">n= </m:t>
-                            </m:r>
-                            <m:func>
-                              <m:funcPr>
-                                <m:ctrlPr>
-                                  <w:rPr>
-                                    <w:rFonts w:ascii="Cambria Math" w:hAnsi="Cambria Math" w:cs="Times New Roman"/>
-                                    <w:i/>
-                                    <w:sz w:val="24"/>
-                                    <w:szCs w:val="24"/>
-                                  </w:rPr>
-                                </m:ctrlPr>
-                              </m:funcPr>
-                              <m:fName>
-                                <m:limLow>
-                                  <m:limLowPr>
-                                    <m:ctrlPr>
-                                      <w:rPr>
-                                        <w:rFonts w:ascii="Cambria Math" w:hAnsi="Cambria Math" w:cs="Times New Roman"/>
-                                        <w:i/>
-                                        <w:sz w:val="24"/>
-                                        <w:szCs w:val="24"/>
-                                      </w:rPr>
-                                    </m:ctrlPr>
-                                  </m:limLowPr>
-                                  <m:e>
-                                    <m:r>
-                                      <m:rPr>
-                                        <m:sty m:val="p"/>
-                                      </m:rPr>
-                                      <w:rPr>
-                                        <w:rFonts w:ascii="Cambria Math" w:hAnsi="Cambria Math" w:cs="Times New Roman"/>
-                                        <w:sz w:val="24"/>
-                                        <w:szCs w:val="24"/>
-                                      </w:rPr>
-                                      <m:t>lim</m:t>
-                                    </m:r>
-                                  </m:e>
-                                  <m:lim>
-                                    <m:d>
-                                      <m:dPr>
-                                        <m:ctrlPr>
-                                          <w:rPr>
-                                            <w:rFonts w:ascii="Cambria Math" w:hAnsi="Cambria Math" w:cs="Times New Roman"/>
-                                            <w:i/>
-                                            <w:sz w:val="24"/>
-                                            <w:szCs w:val="24"/>
-                                          </w:rPr>
-                                        </m:ctrlPr>
-                                      </m:dPr>
-                                      <m:e>
-                                        <m:r>
-                                          <w:rPr>
-                                            <w:rFonts w:ascii="Cambria Math" w:hAnsi="Cambria Math" w:cs="Times New Roman"/>
-                                            <w:sz w:val="24"/>
-                                            <w:szCs w:val="24"/>
-                                          </w:rPr>
-                                          <m:t>n → ∞</m:t>
-                                        </m:r>
-                                      </m:e>
-                                    </m:d>
-                                  </m:lim>
-                                </m:limLow>
-                              </m:fName>
-                              <m:e>
-                                <m:d>
-                                  <m:dPr>
-                                    <m:ctrlPr>
-                                      <w:rPr>
-                                        <w:rFonts w:ascii="Cambria Math" w:hAnsi="Cambria Math" w:cs="Times New Roman"/>
-                                        <w:i/>
-                                        <w:sz w:val="24"/>
-                                        <w:szCs w:val="24"/>
-                                      </w:rPr>
-                                    </m:ctrlPr>
-                                  </m:dPr>
-                                  <m:e>
-                                    <m:r>
-                                      <w:rPr>
-                                        <w:rFonts w:ascii="Cambria Math" w:hAnsi="Cambria Math" w:cs="Times New Roman"/>
-                                        <w:sz w:val="24"/>
-                                        <w:szCs w:val="24"/>
-                                      </w:rPr>
-                                      <m:t>6</m:t>
-                                    </m:r>
-                                  </m:e>
-                                </m:d>
-                              </m:e>
-                            </m:func>
-                          </m:e>
-                        </m:d>
-                      </m:sub>
-                    </m:sSub>
                   </m:e>
-                </m:d>
+                  <m:sub>
+                    <m:r>
+                      <w:rPr>
+                        <w:rFonts w:ascii="Cambria Math" w:hAnsi="Cambria Math" w:cs="Times New Roman"/>
+                        <w:sz w:val="24"/>
+                        <w:szCs w:val="24"/>
+                      </w:rPr>
+                      <m:t>n</m:t>
+                    </m:r>
+                  </m:sub>
+                </m:sSub>
                 <m:r>
                   <w:rPr>
                     <w:rFonts w:ascii="Cambria Math" w:hAnsi="Cambria Math" w:cs="Times New Roman"/>
@@ -904,10 +605,10 @@
                             <w:sz w:val="24"/>
                             <w:szCs w:val="24"/>
                           </w:rPr>
-                          <m:t xml:space="preserve">x = ζ → </m:t>
+                          <m:t xml:space="preserve">x → ζ = 8,39416  .   .   .    </m:t>
                         </m:r>
-                        <m:d>
-                          <m:dPr>
+                        <m:sSub>
+                          <m:sSubPr>
                             <m:ctrlPr>
                               <w:rPr>
                                 <w:rFonts w:ascii="Cambria Math" w:hAnsi="Cambria Math" w:cs="Times New Roman"/>
@@ -916,7 +617,7 @@
                                 <w:szCs w:val="24"/>
                               </w:rPr>
                             </m:ctrlPr>
-                          </m:dPr>
+                          </m:sSubPr>
                           <m:e>
                             <m:r>
                               <w:rPr>
@@ -924,143 +625,20 @@
                                 <w:sz w:val="24"/>
                                 <w:szCs w:val="24"/>
                               </w:rPr>
-                              <m:t xml:space="preserve"> -8, 3941</m:t>
+                              <m:t>6</m:t>
                             </m:r>
-                            <m:sSub>
-                              <m:sSubPr>
-                                <m:ctrlPr>
-                                  <w:rPr>
-                                    <w:rFonts w:ascii="Cambria Math" w:hAnsi="Cambria Math" w:cs="Times New Roman"/>
-                                    <w:i/>
-                                    <w:sz w:val="24"/>
-                                    <w:szCs w:val="24"/>
-                                  </w:rPr>
-                                </m:ctrlPr>
-                              </m:sSubPr>
-                              <m:e>
-                                <m:r>
-                                  <w:rPr>
-                                    <w:rFonts w:ascii="Cambria Math" w:hAnsi="Cambria Math" w:cs="Times New Roman"/>
-                                    <w:sz w:val="24"/>
-                                    <w:szCs w:val="24"/>
-                                  </w:rPr>
-                                  <m:t>6</m:t>
-                                </m:r>
-                              </m:e>
-                              <m:sub>
-                                <m:d>
-                                  <m:dPr>
-                                    <m:ctrlPr>
-                                      <w:rPr>
-                                        <w:rFonts w:ascii="Cambria Math" w:hAnsi="Cambria Math" w:cs="Times New Roman"/>
-                                        <w:i/>
-                                        <w:sz w:val="24"/>
-                                        <w:szCs w:val="24"/>
-                                      </w:rPr>
-                                    </m:ctrlPr>
-                                  </m:dPr>
-                                  <m:e>
-                                    <m:r>
-                                      <w:rPr>
-                                        <w:rFonts w:ascii="Cambria Math" w:hAnsi="Cambria Math" w:cs="Times New Roman"/>
-                                        <w:sz w:val="24"/>
-                                        <w:szCs w:val="24"/>
-                                      </w:rPr>
-                                      <m:t xml:space="preserve">n= </m:t>
-                                    </m:r>
-                                    <m:func>
-                                      <m:funcPr>
-                                        <m:ctrlPr>
-                                          <w:rPr>
-                                            <w:rFonts w:ascii="Cambria Math" w:hAnsi="Cambria Math" w:cs="Times New Roman"/>
-                                            <w:i/>
-                                            <w:sz w:val="24"/>
-                                            <w:szCs w:val="24"/>
-                                          </w:rPr>
-                                        </m:ctrlPr>
-                                      </m:funcPr>
-                                      <m:fName>
-                                        <m:limLow>
-                                          <m:limLowPr>
-                                            <m:ctrlPr>
-                                              <w:rPr>
-                                                <w:rFonts w:ascii="Cambria Math" w:hAnsi="Cambria Math" w:cs="Times New Roman"/>
-                                                <w:i/>
-                                                <w:sz w:val="24"/>
-                                                <w:szCs w:val="24"/>
-                                              </w:rPr>
-                                            </m:ctrlPr>
-                                          </m:limLowPr>
-                                          <m:e>
-                                            <m:r>
-                                              <m:rPr>
-                                                <m:sty m:val="p"/>
-                                              </m:rPr>
-                                              <w:rPr>
-                                                <w:rFonts w:ascii="Cambria Math" w:hAnsi="Cambria Math" w:cs="Times New Roman"/>
-                                                <w:sz w:val="24"/>
-                                                <w:szCs w:val="24"/>
-                                              </w:rPr>
-                                              <m:t>lim</m:t>
-                                            </m:r>
-                                          </m:e>
-                                          <m:lim>
-                                            <m:d>
-                                              <m:dPr>
-                                                <m:ctrlPr>
-                                                  <w:rPr>
-                                                    <w:rFonts w:ascii="Cambria Math" w:hAnsi="Cambria Math" w:cs="Times New Roman"/>
-                                                    <w:i/>
-                                                    <w:sz w:val="24"/>
-                                                    <w:szCs w:val="24"/>
-                                                  </w:rPr>
-                                                </m:ctrlPr>
-                                              </m:dPr>
-                                              <m:e>
-                                                <m:r>
-                                                  <w:rPr>
-                                                    <w:rFonts w:ascii="Cambria Math" w:hAnsi="Cambria Math" w:cs="Times New Roman"/>
-                                                    <w:sz w:val="24"/>
-                                                    <w:szCs w:val="24"/>
-                                                  </w:rPr>
-                                                  <m:t>n → ∞</m:t>
-                                                </m:r>
-                                              </m:e>
-                                            </m:d>
-                                          </m:lim>
-                                        </m:limLow>
-                                      </m:fName>
-                                      <m:e>
-                                        <m:d>
-                                          <m:dPr>
-                                            <m:ctrlPr>
-                                              <w:rPr>
-                                                <w:rFonts w:ascii="Cambria Math" w:hAnsi="Cambria Math" w:cs="Times New Roman"/>
-                                                <w:i/>
-                                                <w:sz w:val="24"/>
-                                                <w:szCs w:val="24"/>
-                                              </w:rPr>
-                                            </m:ctrlPr>
-                                          </m:dPr>
-                                          <m:e>
-                                            <m:r>
-                                              <w:rPr>
-                                                <w:rFonts w:ascii="Cambria Math" w:hAnsi="Cambria Math" w:cs="Times New Roman"/>
-                                                <w:sz w:val="24"/>
-                                                <w:szCs w:val="24"/>
-                                              </w:rPr>
-                                              <m:t>6</m:t>
-                                            </m:r>
-                                          </m:e>
-                                        </m:d>
-                                      </m:e>
-                                    </m:func>
-                                  </m:e>
-                                </m:d>
-                              </m:sub>
-                            </m:sSub>
                           </m:e>
-                        </m:d>
+                          <m:sub>
+                            <m:r>
+                              <w:rPr>
+                                <w:rFonts w:ascii="Cambria Math" w:hAnsi="Cambria Math" w:cs="Times New Roman"/>
+                                <w:sz w:val="24"/>
+                                <w:szCs w:val="24"/>
+                              </w:rPr>
+                              <m:t>n</m:t>
+                            </m:r>
+                          </m:sub>
+                        </m:sSub>
                         <m:r>
                           <w:rPr>
                             <w:rFonts w:ascii="Cambria Math" w:hAnsi="Cambria Math" w:cs="Times New Roman"/>

</xml_diff>